<commit_message>
update document and add document
</commit_message>
<xml_diff>
--- a/DRF_Document.docx
+++ b/DRF_Document.docx
@@ -1985,7 +1985,23 @@
           <w:sz w:val="36"/>
           <w:szCs w:val="28"/>
         </w:rPr>
-        <w:t xml:space="preserve"> the complex data which can also validate for use for that we </w:t>
+        <w:t xml:space="preserve"> the complex data </w:t>
+      </w:r>
+      <w:r>
+        <w:rPr>
+          <w:color w:val="00B050"/>
+          <w:sz w:val="36"/>
+          <w:szCs w:val="28"/>
+        </w:rPr>
+        <w:t xml:space="preserve">which can also validate </w:t>
+      </w:r>
+      <w:r>
+        <w:rPr>
+          <w:color w:val="00B050"/>
+          <w:sz w:val="36"/>
+          <w:szCs w:val="28"/>
+        </w:rPr>
+        <w:t xml:space="preserve">for that we </w:t>
       </w:r>
       <w:proofErr w:type="gramStart"/>
       <w:r>
@@ -2008,10 +2024,41 @@
     </w:p>
     <w:p>
       <w:pPr>
+        <w:jc w:val="center"/>
+        <w:rPr>
+          <w:b/>
+          <w:sz w:val="36"/>
+          <w:szCs w:val="28"/>
+          <w:u w:val="single"/>
+        </w:rPr>
+      </w:pPr>
+      <w:r>
+        <w:rPr>
+          <w:b/>
+          <w:sz w:val="36"/>
+          <w:szCs w:val="28"/>
+          <w:u w:val="single"/>
+        </w:rPr>
+        <w:t>SERIALIZERS</w:t>
+      </w:r>
+      <w:r>
+        <w:rPr>
+          <w:b/>
+          <w:sz w:val="36"/>
+          <w:szCs w:val="28"/>
+          <w:u w:val="single"/>
+        </w:rPr>
+        <w:t>:</w:t>
+      </w:r>
+    </w:p>
+    <w:p>
+      <w:pPr>
         <w:jc w:val="both"/>
         <w:rPr>
-          <w:sz w:val="36"/>
-          <w:szCs w:val="28"/>
+          <w:b/>
+          <w:sz w:val="36"/>
+          <w:szCs w:val="28"/>
+          <w:u w:val="single"/>
         </w:rPr>
       </w:pPr>
     </w:p>

</xml_diff>

<commit_message>
Learn about authentication-Session based
</commit_message>
<xml_diff>
--- a/DRF_Document.docx
+++ b/DRF_Document.docx
@@ -9867,6 +9867,7 @@
       <w:r>
         <w:rPr>
           <w:rFonts w:ascii="Times New Roman" w:eastAsia="Times New Roman" w:hAnsi="Times New Roman" w:cs="Times New Roman"/>
+          <w:noProof/>
           <w:color w:val="000000" w:themeColor="text1"/>
           <w:sz w:val="36"/>
           <w:szCs w:val="36"/>
@@ -10825,10 +10826,2625 @@
     <w:p>
       <w:pPr>
         <w:spacing w:before="100" w:beforeAutospacing="1" w:after="100" w:afterAutospacing="1" w:line="240" w:lineRule="auto"/>
+        <w:jc w:val="center"/>
+        <w:rPr>
+          <w:rFonts w:ascii="Times New Roman" w:eastAsia="Times New Roman" w:hAnsi="Times New Roman" w:cs="Times New Roman"/>
+          <w:b/>
+          <w:color w:val="FF0000"/>
+          <w:sz w:val="36"/>
+          <w:szCs w:val="36"/>
+          <w:u w:val="single"/>
+        </w:rPr>
+      </w:pPr>
+      <w:r>
+        <w:rPr>
+          <w:rFonts w:ascii="Times New Roman" w:eastAsia="Times New Roman" w:hAnsi="Times New Roman" w:cs="Times New Roman"/>
+          <w:b/>
+          <w:color w:val="FF0000"/>
+          <w:sz w:val="36"/>
+          <w:szCs w:val="36"/>
+          <w:u w:val="single"/>
+        </w:rPr>
+        <w:lastRenderedPageBreak/>
+        <w:t>Upload File:</w:t>
+      </w:r>
+    </w:p>
+    <w:p>
+      <w:pPr>
+        <w:spacing w:before="100" w:beforeAutospacing="1" w:after="100" w:afterAutospacing="1" w:line="240" w:lineRule="auto"/>
         <w:jc w:val="both"/>
         <w:rPr>
           <w:rFonts w:ascii="Times New Roman" w:eastAsia="Times New Roman" w:hAnsi="Times New Roman" w:cs="Times New Roman"/>
-          <w:color w:val="FF0000"/>
+          <w:b/>
+          <w:sz w:val="36"/>
+          <w:szCs w:val="36"/>
+        </w:rPr>
+      </w:pPr>
+      <w:proofErr w:type="gramStart"/>
+      <w:r>
+        <w:rPr>
+          <w:rFonts w:ascii="Times New Roman" w:eastAsia="Times New Roman" w:hAnsi="Times New Roman" w:cs="Times New Roman"/>
+          <w:b/>
+          <w:sz w:val="36"/>
+          <w:szCs w:val="36"/>
+        </w:rPr>
+        <w:t>1.Add</w:t>
+      </w:r>
+      <w:proofErr w:type="gramEnd"/>
+      <w:r>
+        <w:rPr>
+          <w:rFonts w:ascii="Times New Roman" w:eastAsia="Times New Roman" w:hAnsi="Times New Roman" w:cs="Times New Roman"/>
+          <w:b/>
+          <w:sz w:val="36"/>
+          <w:szCs w:val="36"/>
+        </w:rPr>
+        <w:t xml:space="preserve"> to settings.py</w:t>
+      </w:r>
+    </w:p>
+    <w:p>
+      <w:pPr>
+        <w:spacing w:before="100" w:beforeAutospacing="1" w:after="100" w:afterAutospacing="1" w:line="240" w:lineRule="auto"/>
+        <w:jc w:val="both"/>
+        <w:rPr>
+          <w:rFonts w:ascii="Times New Roman" w:eastAsia="Times New Roman" w:hAnsi="Times New Roman" w:cs="Times New Roman"/>
+          <w:sz w:val="28"/>
+          <w:szCs w:val="36"/>
+        </w:rPr>
+      </w:pPr>
+      <w:r>
+        <w:rPr>
+          <w:rFonts w:ascii="Times New Roman" w:eastAsia="Times New Roman" w:hAnsi="Times New Roman" w:cs="Times New Roman"/>
+          <w:sz w:val="28"/>
+          <w:szCs w:val="36"/>
+        </w:rPr>
+        <w:t>INSTALLED_APPS = [</w:t>
+      </w:r>
+    </w:p>
+    <w:p>
+      <w:pPr>
+        <w:spacing w:before="100" w:beforeAutospacing="1" w:after="100" w:afterAutospacing="1" w:line="240" w:lineRule="auto"/>
+        <w:jc w:val="both"/>
+        <w:rPr>
+          <w:rFonts w:ascii="Times New Roman" w:eastAsia="Times New Roman" w:hAnsi="Times New Roman" w:cs="Times New Roman"/>
+          <w:sz w:val="28"/>
+          <w:szCs w:val="36"/>
+        </w:rPr>
+      </w:pPr>
+      <w:r>
+        <w:rPr>
+          <w:rFonts w:ascii="Times New Roman" w:eastAsia="Times New Roman" w:hAnsi="Times New Roman" w:cs="Times New Roman"/>
+          <w:sz w:val="28"/>
+          <w:szCs w:val="36"/>
+        </w:rPr>
+        <w:t xml:space="preserve">    ...</w:t>
+      </w:r>
+    </w:p>
+    <w:p>
+      <w:pPr>
+        <w:spacing w:before="100" w:beforeAutospacing="1" w:after="100" w:afterAutospacing="1" w:line="240" w:lineRule="auto"/>
+        <w:jc w:val="both"/>
+        <w:rPr>
+          <w:rFonts w:ascii="Times New Roman" w:eastAsia="Times New Roman" w:hAnsi="Times New Roman" w:cs="Times New Roman"/>
+          <w:sz w:val="28"/>
+          <w:szCs w:val="36"/>
+        </w:rPr>
+      </w:pPr>
+      <w:r>
+        <w:rPr>
+          <w:rFonts w:ascii="Times New Roman" w:eastAsia="Times New Roman" w:hAnsi="Times New Roman" w:cs="Times New Roman"/>
+          <w:sz w:val="28"/>
+          <w:szCs w:val="36"/>
+        </w:rPr>
+        <w:t xml:space="preserve">    "</w:t>
+      </w:r>
+      <w:proofErr w:type="spellStart"/>
+      <w:r>
+        <w:rPr>
+          <w:rFonts w:ascii="Times New Roman" w:eastAsia="Times New Roman" w:hAnsi="Times New Roman" w:cs="Times New Roman"/>
+          <w:sz w:val="28"/>
+          <w:szCs w:val="36"/>
+        </w:rPr>
+        <w:t>rest_framework</w:t>
+      </w:r>
+      <w:proofErr w:type="spellEnd"/>
+      <w:r>
+        <w:rPr>
+          <w:rFonts w:ascii="Times New Roman" w:eastAsia="Times New Roman" w:hAnsi="Times New Roman" w:cs="Times New Roman"/>
+          <w:sz w:val="28"/>
+          <w:szCs w:val="36"/>
+        </w:rPr>
+        <w:t>",</w:t>
+      </w:r>
+    </w:p>
+    <w:p>
+      <w:pPr>
+        <w:spacing w:before="100" w:beforeAutospacing="1" w:after="100" w:afterAutospacing="1" w:line="240" w:lineRule="auto"/>
+        <w:jc w:val="both"/>
+        <w:rPr>
+          <w:rFonts w:ascii="Times New Roman" w:eastAsia="Times New Roman" w:hAnsi="Times New Roman" w:cs="Times New Roman"/>
+          <w:sz w:val="28"/>
+          <w:szCs w:val="36"/>
+        </w:rPr>
+      </w:pPr>
+      <w:r>
+        <w:rPr>
+          <w:rFonts w:ascii="Times New Roman" w:eastAsia="Times New Roman" w:hAnsi="Times New Roman" w:cs="Times New Roman"/>
+          <w:sz w:val="28"/>
+          <w:szCs w:val="36"/>
+        </w:rPr>
+        <w:t xml:space="preserve">    "</w:t>
+      </w:r>
+      <w:proofErr w:type="gramStart"/>
+      <w:r>
+        <w:rPr>
+          <w:rFonts w:ascii="Times New Roman" w:eastAsia="Times New Roman" w:hAnsi="Times New Roman" w:cs="Times New Roman"/>
+          <w:sz w:val="28"/>
+          <w:szCs w:val="36"/>
+        </w:rPr>
+        <w:t>upload</w:t>
+      </w:r>
+      <w:proofErr w:type="gramEnd"/>
+      <w:r>
+        <w:rPr>
+          <w:rFonts w:ascii="Times New Roman" w:eastAsia="Times New Roman" w:hAnsi="Times New Roman" w:cs="Times New Roman"/>
+          <w:sz w:val="28"/>
+          <w:szCs w:val="36"/>
+        </w:rPr>
+        <w:t xml:space="preserve">", </w:t>
+      </w:r>
+      <w:r>
+        <w:rPr>
+          <w:rFonts w:ascii="Times New Roman" w:eastAsia="Times New Roman" w:hAnsi="Times New Roman" w:cs="Times New Roman"/>
+          <w:color w:val="FF0000"/>
+          <w:sz w:val="28"/>
+          <w:szCs w:val="36"/>
+        </w:rPr>
+        <w:t>app name</w:t>
+      </w:r>
+    </w:p>
+    <w:p>
+      <w:pPr>
+        <w:spacing w:before="100" w:beforeAutospacing="1" w:after="100" w:afterAutospacing="1" w:line="240" w:lineRule="auto"/>
+        <w:jc w:val="both"/>
+        <w:rPr>
+          <w:rFonts w:ascii="Times New Roman" w:eastAsia="Times New Roman" w:hAnsi="Times New Roman" w:cs="Times New Roman"/>
+          <w:sz w:val="28"/>
+          <w:szCs w:val="36"/>
+        </w:rPr>
+      </w:pPr>
+      <w:r>
+        <w:rPr>
+          <w:rFonts w:ascii="Times New Roman" w:eastAsia="Times New Roman" w:hAnsi="Times New Roman" w:cs="Times New Roman"/>
+          <w:sz w:val="28"/>
+          <w:szCs w:val="36"/>
+        </w:rPr>
+        <w:t xml:space="preserve">] </w:t>
+      </w:r>
+    </w:p>
+    <w:p>
+      <w:pPr>
+        <w:pStyle w:val="Heading1"/>
+      </w:pPr>
+      <w:r>
+        <w:rPr>
+          <w:sz w:val="36"/>
+          <w:szCs w:val="36"/>
+        </w:rPr>
+        <w:t>2.</w:t>
+      </w:r>
+      <w:r>
+        <w:t xml:space="preserve"> Install Pillow</w:t>
+      </w:r>
+    </w:p>
+    <w:p>
+      <w:pPr>
+        <w:spacing w:before="100" w:beforeAutospacing="1" w:after="100" w:afterAutospacing="1" w:line="240" w:lineRule="auto"/>
+        <w:rPr>
+          <w:rFonts w:ascii="Times New Roman" w:eastAsia="Times New Roman" w:hAnsi="Times New Roman" w:cs="Times New Roman"/>
+          <w:sz w:val="24"/>
+          <w:szCs w:val="24"/>
+        </w:rPr>
+      </w:pPr>
+      <w:r>
+        <w:rPr>
+          <w:rFonts w:ascii="Times New Roman" w:eastAsia="Times New Roman" w:hAnsi="Times New Roman" w:cs="Times New Roman"/>
+          <w:sz w:val="24"/>
+          <w:szCs w:val="24"/>
+        </w:rPr>
+        <w:t>If you're uploading images, install Pillow.</w:t>
+      </w:r>
+    </w:p>
+    <w:p>
+      <w:pPr>
+        <w:tabs>
+          <w:tab w:val="left" w:pos="916"/>
+          <w:tab w:val="left" w:pos="1832"/>
+          <w:tab w:val="left" w:pos="2748"/>
+          <w:tab w:val="left" w:pos="3664"/>
+          <w:tab w:val="left" w:pos="4580"/>
+          <w:tab w:val="left" w:pos="5496"/>
+          <w:tab w:val="left" w:pos="6412"/>
+          <w:tab w:val="left" w:pos="7328"/>
+          <w:tab w:val="left" w:pos="8244"/>
+          <w:tab w:val="left" w:pos="9160"/>
+          <w:tab w:val="left" w:pos="10076"/>
+          <w:tab w:val="left" w:pos="10992"/>
+          <w:tab w:val="left" w:pos="11908"/>
+          <w:tab w:val="left" w:pos="12824"/>
+          <w:tab w:val="left" w:pos="13740"/>
+          <w:tab w:val="left" w:pos="14656"/>
+        </w:tabs>
+        <w:spacing w:after="0" w:line="240" w:lineRule="auto"/>
+        <w:rPr>
+          <w:rFonts w:ascii="Courier New" w:eastAsia="Times New Roman" w:hAnsi="Courier New" w:cs="Courier New"/>
+          <w:color w:val="FF0000"/>
+          <w:sz w:val="20"/>
+          <w:szCs w:val="20"/>
+        </w:rPr>
+      </w:pPr>
+      <w:proofErr w:type="gramStart"/>
+      <w:r>
+        <w:rPr>
+          <w:rFonts w:ascii="Courier New" w:eastAsia="Times New Roman" w:hAnsi="Courier New" w:cs="Courier New"/>
+          <w:color w:val="FF0000"/>
+          <w:sz w:val="20"/>
+          <w:szCs w:val="20"/>
+        </w:rPr>
+        <w:t>pip</w:t>
+      </w:r>
+      <w:proofErr w:type="gramEnd"/>
+      <w:r>
+        <w:rPr>
+          <w:rFonts w:ascii="Courier New" w:eastAsia="Times New Roman" w:hAnsi="Courier New" w:cs="Courier New"/>
+          <w:color w:val="FF0000"/>
+          <w:sz w:val="20"/>
+          <w:szCs w:val="20"/>
+        </w:rPr>
+        <w:t xml:space="preserve"> install pillow</w:t>
+      </w:r>
+    </w:p>
+    <w:p>
+      <w:pPr>
+        <w:spacing w:before="100" w:beforeAutospacing="1" w:after="100" w:afterAutospacing="1" w:line="240" w:lineRule="auto"/>
+        <w:rPr>
+          <w:rFonts w:ascii="Times New Roman" w:eastAsia="Times New Roman" w:hAnsi="Times New Roman" w:cs="Times New Roman"/>
+          <w:sz w:val="24"/>
+          <w:szCs w:val="24"/>
+        </w:rPr>
+      </w:pPr>
+      <w:r>
+        <w:rPr>
+          <w:rFonts w:ascii="Times New Roman" w:eastAsia="Times New Roman" w:hAnsi="Times New Roman" w:cs="Times New Roman"/>
+          <w:sz w:val="24"/>
+          <w:szCs w:val="24"/>
+        </w:rPr>
+        <w:t>Why?</w:t>
+      </w:r>
+    </w:p>
+    <w:p>
+      <w:pPr>
+        <w:spacing w:before="100" w:beforeAutospacing="1" w:after="100" w:afterAutospacing="1" w:line="240" w:lineRule="auto"/>
+        <w:rPr>
+          <w:rFonts w:ascii="Times New Roman" w:eastAsia="Times New Roman" w:hAnsi="Times New Roman" w:cs="Times New Roman"/>
+          <w:sz w:val="24"/>
+          <w:szCs w:val="24"/>
+        </w:rPr>
+      </w:pPr>
+      <w:proofErr w:type="spellStart"/>
+      <w:r>
+        <w:rPr>
+          <w:rFonts w:ascii="Times New Roman" w:eastAsia="Times New Roman" w:hAnsi="Times New Roman" w:cs="Times New Roman"/>
+          <w:sz w:val="24"/>
+          <w:szCs w:val="24"/>
+        </w:rPr>
+        <w:t>Django</w:t>
+      </w:r>
+      <w:proofErr w:type="spellEnd"/>
+      <w:r>
+        <w:rPr>
+          <w:rFonts w:ascii="Times New Roman" w:eastAsia="Times New Roman" w:hAnsi="Times New Roman" w:cs="Times New Roman"/>
+          <w:sz w:val="24"/>
+          <w:szCs w:val="24"/>
+        </w:rPr>
+        <w:t xml:space="preserve"> cannot handle image validation without it.</w:t>
+      </w:r>
+    </w:p>
+    <w:p>
+      <w:pPr>
+        <w:spacing w:before="100" w:beforeAutospacing="1" w:after="100" w:afterAutospacing="1" w:line="240" w:lineRule="auto"/>
+        <w:rPr>
+          <w:rFonts w:ascii="Times New Roman" w:eastAsia="Times New Roman" w:hAnsi="Times New Roman" w:cs="Times New Roman"/>
+          <w:b/>
+          <w:sz w:val="40"/>
+          <w:szCs w:val="24"/>
+        </w:rPr>
+      </w:pPr>
+      <w:proofErr w:type="gramStart"/>
+      <w:r>
+        <w:rPr>
+          <w:rFonts w:ascii="Times New Roman" w:eastAsia="Times New Roman" w:hAnsi="Times New Roman" w:cs="Times New Roman"/>
+          <w:b/>
+          <w:sz w:val="40"/>
+          <w:szCs w:val="24"/>
+        </w:rPr>
+        <w:t>3.</w:t>
+      </w:r>
+      <w:r>
+        <w:rPr>
+          <w:b/>
+          <w:sz w:val="36"/>
+        </w:rPr>
+        <w:t>Create</w:t>
+      </w:r>
+      <w:proofErr w:type="gramEnd"/>
+      <w:r>
+        <w:rPr>
+          <w:b/>
+          <w:sz w:val="36"/>
+        </w:rPr>
+        <w:t xml:space="preserve"> Model</w:t>
+      </w:r>
+    </w:p>
+    <w:p>
+      <w:pPr>
+        <w:tabs>
+          <w:tab w:val="left" w:pos="916"/>
+          <w:tab w:val="left" w:pos="1832"/>
+          <w:tab w:val="left" w:pos="2748"/>
+          <w:tab w:val="left" w:pos="3664"/>
+          <w:tab w:val="left" w:pos="4580"/>
+          <w:tab w:val="left" w:pos="5496"/>
+          <w:tab w:val="left" w:pos="6412"/>
+          <w:tab w:val="left" w:pos="7328"/>
+          <w:tab w:val="left" w:pos="8244"/>
+          <w:tab w:val="left" w:pos="9160"/>
+          <w:tab w:val="left" w:pos="10076"/>
+          <w:tab w:val="left" w:pos="10992"/>
+          <w:tab w:val="left" w:pos="11908"/>
+          <w:tab w:val="left" w:pos="12824"/>
+          <w:tab w:val="left" w:pos="13740"/>
+          <w:tab w:val="left" w:pos="14656"/>
+        </w:tabs>
+        <w:spacing w:after="0" w:line="240" w:lineRule="auto"/>
+        <w:rPr>
+          <w:rFonts w:ascii="Courier New" w:eastAsia="Times New Roman" w:hAnsi="Courier New" w:cs="Courier New"/>
+          <w:color w:val="FF0000"/>
+          <w:sz w:val="20"/>
+          <w:szCs w:val="20"/>
+        </w:rPr>
+      </w:pPr>
+      <w:proofErr w:type="gramStart"/>
+      <w:r>
+        <w:rPr>
+          <w:rFonts w:ascii="Courier New" w:eastAsia="Times New Roman" w:hAnsi="Courier New" w:cs="Courier New"/>
+          <w:color w:val="FF0000"/>
+          <w:sz w:val="20"/>
+          <w:szCs w:val="20"/>
+        </w:rPr>
+        <w:t>from</w:t>
+      </w:r>
+      <w:proofErr w:type="gramEnd"/>
+      <w:r>
+        <w:rPr>
+          <w:rFonts w:ascii="Courier New" w:eastAsia="Times New Roman" w:hAnsi="Courier New" w:cs="Courier New"/>
+          <w:color w:val="FF0000"/>
+          <w:sz w:val="20"/>
+          <w:szCs w:val="20"/>
+        </w:rPr>
+        <w:t xml:space="preserve"> </w:t>
+      </w:r>
+      <w:proofErr w:type="spellStart"/>
+      <w:r>
+        <w:rPr>
+          <w:rFonts w:ascii="Courier New" w:eastAsia="Times New Roman" w:hAnsi="Courier New" w:cs="Courier New"/>
+          <w:color w:val="FF0000"/>
+          <w:sz w:val="20"/>
+          <w:szCs w:val="20"/>
+        </w:rPr>
+        <w:t>django.db</w:t>
+      </w:r>
+      <w:proofErr w:type="spellEnd"/>
+      <w:r>
+        <w:rPr>
+          <w:rFonts w:ascii="Courier New" w:eastAsia="Times New Roman" w:hAnsi="Courier New" w:cs="Courier New"/>
+          <w:color w:val="FF0000"/>
+          <w:sz w:val="20"/>
+          <w:szCs w:val="20"/>
+        </w:rPr>
+        <w:t xml:space="preserve"> import models</w:t>
+      </w:r>
+    </w:p>
+    <w:p>
+      <w:pPr>
+        <w:tabs>
+          <w:tab w:val="left" w:pos="916"/>
+          <w:tab w:val="left" w:pos="1832"/>
+          <w:tab w:val="left" w:pos="2748"/>
+          <w:tab w:val="left" w:pos="3664"/>
+          <w:tab w:val="left" w:pos="4580"/>
+          <w:tab w:val="left" w:pos="5496"/>
+          <w:tab w:val="left" w:pos="6412"/>
+          <w:tab w:val="left" w:pos="7328"/>
+          <w:tab w:val="left" w:pos="8244"/>
+          <w:tab w:val="left" w:pos="9160"/>
+          <w:tab w:val="left" w:pos="10076"/>
+          <w:tab w:val="left" w:pos="10992"/>
+          <w:tab w:val="left" w:pos="11908"/>
+          <w:tab w:val="left" w:pos="12824"/>
+          <w:tab w:val="left" w:pos="13740"/>
+          <w:tab w:val="left" w:pos="14656"/>
+        </w:tabs>
+        <w:spacing w:after="0" w:line="240" w:lineRule="auto"/>
+        <w:rPr>
+          <w:rFonts w:ascii="Courier New" w:eastAsia="Times New Roman" w:hAnsi="Courier New" w:cs="Courier New"/>
+          <w:color w:val="FF0000"/>
+          <w:sz w:val="20"/>
+          <w:szCs w:val="20"/>
+        </w:rPr>
+      </w:pPr>
+    </w:p>
+    <w:p>
+      <w:pPr>
+        <w:tabs>
+          <w:tab w:val="left" w:pos="916"/>
+          <w:tab w:val="left" w:pos="1832"/>
+          <w:tab w:val="left" w:pos="2748"/>
+          <w:tab w:val="left" w:pos="3664"/>
+          <w:tab w:val="left" w:pos="4580"/>
+          <w:tab w:val="left" w:pos="5496"/>
+          <w:tab w:val="left" w:pos="6412"/>
+          <w:tab w:val="left" w:pos="7328"/>
+          <w:tab w:val="left" w:pos="8244"/>
+          <w:tab w:val="left" w:pos="9160"/>
+          <w:tab w:val="left" w:pos="10076"/>
+          <w:tab w:val="left" w:pos="10992"/>
+          <w:tab w:val="left" w:pos="11908"/>
+          <w:tab w:val="left" w:pos="12824"/>
+          <w:tab w:val="left" w:pos="13740"/>
+          <w:tab w:val="left" w:pos="14656"/>
+        </w:tabs>
+        <w:spacing w:after="0" w:line="240" w:lineRule="auto"/>
+        <w:rPr>
+          <w:rFonts w:ascii="Courier New" w:eastAsia="Times New Roman" w:hAnsi="Courier New" w:cs="Courier New"/>
+          <w:color w:val="FF0000"/>
+          <w:sz w:val="20"/>
+          <w:szCs w:val="20"/>
+        </w:rPr>
+      </w:pPr>
+      <w:proofErr w:type="gramStart"/>
+      <w:r>
+        <w:rPr>
+          <w:rFonts w:ascii="Courier New" w:eastAsia="Times New Roman" w:hAnsi="Courier New" w:cs="Courier New"/>
+          <w:color w:val="FF0000"/>
+          <w:sz w:val="20"/>
+          <w:szCs w:val="20"/>
+        </w:rPr>
+        <w:t>class</w:t>
+      </w:r>
+      <w:proofErr w:type="gramEnd"/>
+      <w:r>
+        <w:rPr>
+          <w:rFonts w:ascii="Courier New" w:eastAsia="Times New Roman" w:hAnsi="Courier New" w:cs="Courier New"/>
+          <w:color w:val="FF0000"/>
+          <w:sz w:val="20"/>
+          <w:szCs w:val="20"/>
+        </w:rPr>
+        <w:t xml:space="preserve"> Profile(</w:t>
+      </w:r>
+      <w:proofErr w:type="spellStart"/>
+      <w:r>
+        <w:rPr>
+          <w:rFonts w:ascii="Courier New" w:eastAsia="Times New Roman" w:hAnsi="Courier New" w:cs="Courier New"/>
+          <w:color w:val="FF0000"/>
+          <w:sz w:val="20"/>
+          <w:szCs w:val="20"/>
+        </w:rPr>
+        <w:t>models.Model</w:t>
+      </w:r>
+      <w:proofErr w:type="spellEnd"/>
+      <w:r>
+        <w:rPr>
+          <w:rFonts w:ascii="Courier New" w:eastAsia="Times New Roman" w:hAnsi="Courier New" w:cs="Courier New"/>
+          <w:color w:val="FF0000"/>
+          <w:sz w:val="20"/>
+          <w:szCs w:val="20"/>
+        </w:rPr>
+        <w:t>):</w:t>
+      </w:r>
+    </w:p>
+    <w:p>
+      <w:pPr>
+        <w:tabs>
+          <w:tab w:val="left" w:pos="916"/>
+          <w:tab w:val="left" w:pos="1832"/>
+          <w:tab w:val="left" w:pos="2748"/>
+          <w:tab w:val="left" w:pos="3664"/>
+          <w:tab w:val="left" w:pos="4580"/>
+          <w:tab w:val="left" w:pos="5496"/>
+          <w:tab w:val="left" w:pos="6412"/>
+          <w:tab w:val="left" w:pos="7328"/>
+          <w:tab w:val="left" w:pos="8244"/>
+          <w:tab w:val="left" w:pos="9160"/>
+          <w:tab w:val="left" w:pos="10076"/>
+          <w:tab w:val="left" w:pos="10992"/>
+          <w:tab w:val="left" w:pos="11908"/>
+          <w:tab w:val="left" w:pos="12824"/>
+          <w:tab w:val="left" w:pos="13740"/>
+          <w:tab w:val="left" w:pos="14656"/>
+        </w:tabs>
+        <w:spacing w:after="0" w:line="240" w:lineRule="auto"/>
+        <w:rPr>
+          <w:rFonts w:ascii="Courier New" w:eastAsia="Times New Roman" w:hAnsi="Courier New" w:cs="Courier New"/>
+          <w:color w:val="FF0000"/>
+          <w:sz w:val="20"/>
+          <w:szCs w:val="20"/>
+        </w:rPr>
+      </w:pPr>
+      <w:r>
+        <w:rPr>
+          <w:rFonts w:ascii="Courier New" w:eastAsia="Times New Roman" w:hAnsi="Courier New" w:cs="Courier New"/>
+          <w:color w:val="FF0000"/>
+          <w:sz w:val="20"/>
+          <w:szCs w:val="20"/>
+        </w:rPr>
+        <w:t xml:space="preserve">    </w:t>
+      </w:r>
+      <w:proofErr w:type="gramStart"/>
+      <w:r>
+        <w:rPr>
+          <w:rFonts w:ascii="Courier New" w:eastAsia="Times New Roman" w:hAnsi="Courier New" w:cs="Courier New"/>
+          <w:color w:val="FF0000"/>
+          <w:sz w:val="20"/>
+          <w:szCs w:val="20"/>
+        </w:rPr>
+        <w:t>name</w:t>
+      </w:r>
+      <w:proofErr w:type="gramEnd"/>
+      <w:r>
+        <w:rPr>
+          <w:rFonts w:ascii="Courier New" w:eastAsia="Times New Roman" w:hAnsi="Courier New" w:cs="Courier New"/>
+          <w:color w:val="FF0000"/>
+          <w:sz w:val="20"/>
+          <w:szCs w:val="20"/>
+        </w:rPr>
+        <w:t xml:space="preserve"> = </w:t>
+      </w:r>
+      <w:proofErr w:type="spellStart"/>
+      <w:r>
+        <w:rPr>
+          <w:rFonts w:ascii="Courier New" w:eastAsia="Times New Roman" w:hAnsi="Courier New" w:cs="Courier New"/>
+          <w:color w:val="FF0000"/>
+          <w:sz w:val="20"/>
+          <w:szCs w:val="20"/>
+        </w:rPr>
+        <w:t>models.CharField</w:t>
+      </w:r>
+      <w:proofErr w:type="spellEnd"/>
+      <w:r>
+        <w:rPr>
+          <w:rFonts w:ascii="Courier New" w:eastAsia="Times New Roman" w:hAnsi="Courier New" w:cs="Courier New"/>
+          <w:color w:val="FF0000"/>
+          <w:sz w:val="20"/>
+          <w:szCs w:val="20"/>
+        </w:rPr>
+        <w:t>(</w:t>
+      </w:r>
+      <w:proofErr w:type="spellStart"/>
+      <w:r>
+        <w:rPr>
+          <w:rFonts w:ascii="Courier New" w:eastAsia="Times New Roman" w:hAnsi="Courier New" w:cs="Courier New"/>
+          <w:color w:val="FF0000"/>
+          <w:sz w:val="20"/>
+          <w:szCs w:val="20"/>
+        </w:rPr>
+        <w:t>max_length</w:t>
+      </w:r>
+      <w:proofErr w:type="spellEnd"/>
+      <w:r>
+        <w:rPr>
+          <w:rFonts w:ascii="Courier New" w:eastAsia="Times New Roman" w:hAnsi="Courier New" w:cs="Courier New"/>
+          <w:color w:val="FF0000"/>
+          <w:sz w:val="20"/>
+          <w:szCs w:val="20"/>
+        </w:rPr>
+        <w:t>=100)</w:t>
+      </w:r>
+    </w:p>
+    <w:p>
+      <w:pPr>
+        <w:tabs>
+          <w:tab w:val="left" w:pos="916"/>
+          <w:tab w:val="left" w:pos="1832"/>
+          <w:tab w:val="left" w:pos="2748"/>
+          <w:tab w:val="left" w:pos="3664"/>
+          <w:tab w:val="left" w:pos="4580"/>
+          <w:tab w:val="left" w:pos="5496"/>
+          <w:tab w:val="left" w:pos="6412"/>
+          <w:tab w:val="left" w:pos="7328"/>
+          <w:tab w:val="left" w:pos="8244"/>
+          <w:tab w:val="left" w:pos="9160"/>
+          <w:tab w:val="left" w:pos="10076"/>
+          <w:tab w:val="left" w:pos="10992"/>
+          <w:tab w:val="left" w:pos="11908"/>
+          <w:tab w:val="left" w:pos="12824"/>
+          <w:tab w:val="left" w:pos="13740"/>
+          <w:tab w:val="left" w:pos="14656"/>
+        </w:tabs>
+        <w:spacing w:after="0" w:line="240" w:lineRule="auto"/>
+        <w:rPr>
+          <w:rFonts w:ascii="Courier New" w:eastAsia="Times New Roman" w:hAnsi="Courier New" w:cs="Courier New"/>
+          <w:color w:val="FF0000"/>
+          <w:sz w:val="20"/>
+          <w:szCs w:val="20"/>
+        </w:rPr>
+      </w:pPr>
+      <w:r>
+        <w:rPr>
+          <w:rFonts w:ascii="Courier New" w:eastAsia="Times New Roman" w:hAnsi="Courier New" w:cs="Courier New"/>
+          <w:color w:val="FF0000"/>
+          <w:sz w:val="20"/>
+          <w:szCs w:val="20"/>
+        </w:rPr>
+        <w:t xml:space="preserve">    </w:t>
+      </w:r>
+      <w:proofErr w:type="gramStart"/>
+      <w:r>
+        <w:rPr>
+          <w:rFonts w:ascii="Courier New" w:eastAsia="Times New Roman" w:hAnsi="Courier New" w:cs="Courier New"/>
+          <w:color w:val="FF0000"/>
+          <w:sz w:val="20"/>
+          <w:szCs w:val="20"/>
+        </w:rPr>
+        <w:t>image</w:t>
+      </w:r>
+      <w:proofErr w:type="gramEnd"/>
+      <w:r>
+        <w:rPr>
+          <w:rFonts w:ascii="Courier New" w:eastAsia="Times New Roman" w:hAnsi="Courier New" w:cs="Courier New"/>
+          <w:color w:val="FF0000"/>
+          <w:sz w:val="20"/>
+          <w:szCs w:val="20"/>
+        </w:rPr>
+        <w:t xml:space="preserve"> = </w:t>
+      </w:r>
+      <w:proofErr w:type="spellStart"/>
+      <w:r>
+        <w:rPr>
+          <w:rFonts w:ascii="Courier New" w:eastAsia="Times New Roman" w:hAnsi="Courier New" w:cs="Courier New"/>
+          <w:color w:val="FF0000"/>
+          <w:sz w:val="20"/>
+          <w:szCs w:val="20"/>
+        </w:rPr>
+        <w:t>models.ImageField</w:t>
+      </w:r>
+      <w:proofErr w:type="spellEnd"/>
+      <w:r>
+        <w:rPr>
+          <w:rFonts w:ascii="Courier New" w:eastAsia="Times New Roman" w:hAnsi="Courier New" w:cs="Courier New"/>
+          <w:color w:val="FF0000"/>
+          <w:sz w:val="20"/>
+          <w:szCs w:val="20"/>
+        </w:rPr>
+        <w:t>(</w:t>
+      </w:r>
+      <w:proofErr w:type="spellStart"/>
+      <w:r>
+        <w:rPr>
+          <w:rFonts w:ascii="Courier New" w:eastAsia="Times New Roman" w:hAnsi="Courier New" w:cs="Courier New"/>
+          <w:color w:val="FF0000"/>
+          <w:sz w:val="20"/>
+          <w:szCs w:val="20"/>
+        </w:rPr>
+        <w:t>upload_to</w:t>
+      </w:r>
+      <w:proofErr w:type="spellEnd"/>
+      <w:r>
+        <w:rPr>
+          <w:rFonts w:ascii="Courier New" w:eastAsia="Times New Roman" w:hAnsi="Courier New" w:cs="Courier New"/>
+          <w:color w:val="FF0000"/>
+          <w:sz w:val="20"/>
+          <w:szCs w:val="20"/>
+        </w:rPr>
+        <w:t>="profiles/")</w:t>
+      </w:r>
+    </w:p>
+    <w:p>
+      <w:pPr>
+        <w:spacing w:before="100" w:beforeAutospacing="1" w:after="100" w:afterAutospacing="1" w:line="240" w:lineRule="auto"/>
+        <w:outlineLvl w:val="2"/>
+        <w:rPr>
+          <w:rFonts w:ascii="Times New Roman" w:eastAsia="Times New Roman" w:hAnsi="Times New Roman" w:cs="Times New Roman"/>
+          <w:b/>
+          <w:bCs/>
+          <w:sz w:val="27"/>
+          <w:szCs w:val="27"/>
+        </w:rPr>
+      </w:pPr>
+      <w:r>
+        <w:rPr>
+          <w:rFonts w:ascii="Times New Roman" w:eastAsia="Times New Roman" w:hAnsi="Times New Roman" w:cs="Times New Roman"/>
+          <w:b/>
+          <w:bCs/>
+          <w:sz w:val="27"/>
+          <w:szCs w:val="27"/>
+        </w:rPr>
+        <w:t xml:space="preserve">What does </w:t>
+      </w:r>
+      <w:proofErr w:type="spellStart"/>
+      <w:r>
+        <w:rPr>
+          <w:rFonts w:ascii="Courier New" w:eastAsia="Times New Roman" w:hAnsi="Courier New" w:cs="Courier New"/>
+          <w:b/>
+          <w:bCs/>
+          <w:sz w:val="20"/>
+          <w:szCs w:val="20"/>
+        </w:rPr>
+        <w:t>upload_to</w:t>
+      </w:r>
+      <w:proofErr w:type="spellEnd"/>
+      <w:r>
+        <w:rPr>
+          <w:rFonts w:ascii="Times New Roman" w:eastAsia="Times New Roman" w:hAnsi="Times New Roman" w:cs="Times New Roman"/>
+          <w:b/>
+          <w:bCs/>
+          <w:sz w:val="27"/>
+          <w:szCs w:val="27"/>
+        </w:rPr>
+        <w:t xml:space="preserve"> mean?</w:t>
+      </w:r>
+    </w:p>
+    <w:p>
+      <w:pPr>
+        <w:spacing w:before="100" w:beforeAutospacing="1" w:after="100" w:afterAutospacing="1" w:line="240" w:lineRule="auto"/>
+        <w:rPr>
+          <w:rFonts w:ascii="Times New Roman" w:eastAsia="Times New Roman" w:hAnsi="Times New Roman" w:cs="Times New Roman"/>
+          <w:sz w:val="24"/>
+          <w:szCs w:val="24"/>
+        </w:rPr>
+      </w:pPr>
+      <w:r>
+        <w:rPr>
+          <w:rFonts w:ascii="Times New Roman" w:eastAsia="Times New Roman" w:hAnsi="Times New Roman" w:cs="Times New Roman"/>
+          <w:sz w:val="24"/>
+          <w:szCs w:val="24"/>
+        </w:rPr>
+        <w:t>Suppose</w:t>
+      </w:r>
+    </w:p>
+    <w:p>
+      <w:pPr>
+        <w:tabs>
+          <w:tab w:val="left" w:pos="916"/>
+          <w:tab w:val="left" w:pos="1832"/>
+          <w:tab w:val="left" w:pos="2748"/>
+          <w:tab w:val="left" w:pos="3664"/>
+          <w:tab w:val="left" w:pos="4580"/>
+          <w:tab w:val="left" w:pos="5496"/>
+          <w:tab w:val="left" w:pos="6412"/>
+          <w:tab w:val="left" w:pos="7328"/>
+          <w:tab w:val="left" w:pos="8244"/>
+          <w:tab w:val="left" w:pos="9160"/>
+          <w:tab w:val="left" w:pos="10076"/>
+          <w:tab w:val="left" w:pos="10992"/>
+          <w:tab w:val="left" w:pos="11908"/>
+          <w:tab w:val="left" w:pos="12824"/>
+          <w:tab w:val="left" w:pos="13740"/>
+          <w:tab w:val="left" w:pos="14656"/>
+        </w:tabs>
+        <w:spacing w:after="0" w:line="240" w:lineRule="auto"/>
+        <w:rPr>
+          <w:rFonts w:ascii="Courier New" w:eastAsia="Times New Roman" w:hAnsi="Courier New" w:cs="Courier New"/>
+          <w:sz w:val="20"/>
+          <w:szCs w:val="20"/>
+        </w:rPr>
+      </w:pPr>
+      <w:proofErr w:type="spellStart"/>
+      <w:r>
+        <w:rPr>
+          <w:rFonts w:ascii="Courier New" w:eastAsia="Times New Roman" w:hAnsi="Courier New" w:cs="Courier New"/>
+          <w:sz w:val="20"/>
+          <w:szCs w:val="20"/>
+        </w:rPr>
+        <w:t>upload_to</w:t>
+      </w:r>
+      <w:proofErr w:type="spellEnd"/>
+      <w:r>
+        <w:rPr>
+          <w:rFonts w:ascii="Courier New" w:eastAsia="Times New Roman" w:hAnsi="Courier New" w:cs="Courier New"/>
+          <w:sz w:val="20"/>
+          <w:szCs w:val="20"/>
+        </w:rPr>
+        <w:t>="profiles/"</w:t>
+      </w:r>
+    </w:p>
+    <w:p>
+      <w:pPr>
+        <w:spacing w:before="100" w:beforeAutospacing="1" w:after="100" w:afterAutospacing="1" w:line="240" w:lineRule="auto"/>
+        <w:rPr>
+          <w:rFonts w:ascii="Times New Roman" w:eastAsia="Times New Roman" w:hAnsi="Times New Roman" w:cs="Times New Roman"/>
+          <w:sz w:val="24"/>
+          <w:szCs w:val="24"/>
+        </w:rPr>
+      </w:pPr>
+      <w:r>
+        <w:rPr>
+          <w:rFonts w:ascii="Times New Roman" w:eastAsia="Times New Roman" w:hAnsi="Times New Roman" w:cs="Times New Roman"/>
+          <w:sz w:val="24"/>
+          <w:szCs w:val="24"/>
+        </w:rPr>
+        <w:t>When a user uploads</w:t>
+      </w:r>
+    </w:p>
+    <w:p>
+      <w:pPr>
+        <w:tabs>
+          <w:tab w:val="left" w:pos="916"/>
+          <w:tab w:val="left" w:pos="1832"/>
+          <w:tab w:val="left" w:pos="2748"/>
+          <w:tab w:val="left" w:pos="3664"/>
+          <w:tab w:val="left" w:pos="4580"/>
+          <w:tab w:val="left" w:pos="5496"/>
+          <w:tab w:val="left" w:pos="6412"/>
+          <w:tab w:val="left" w:pos="7328"/>
+          <w:tab w:val="left" w:pos="8244"/>
+          <w:tab w:val="left" w:pos="9160"/>
+          <w:tab w:val="left" w:pos="10076"/>
+          <w:tab w:val="left" w:pos="10992"/>
+          <w:tab w:val="left" w:pos="11908"/>
+          <w:tab w:val="left" w:pos="12824"/>
+          <w:tab w:val="left" w:pos="13740"/>
+          <w:tab w:val="left" w:pos="14656"/>
+        </w:tabs>
+        <w:spacing w:after="0" w:line="240" w:lineRule="auto"/>
+        <w:rPr>
+          <w:rFonts w:ascii="Courier New" w:eastAsia="Times New Roman" w:hAnsi="Courier New" w:cs="Courier New"/>
+          <w:sz w:val="20"/>
+          <w:szCs w:val="20"/>
+        </w:rPr>
+      </w:pPr>
+      <w:r>
+        <w:rPr>
+          <w:rFonts w:ascii="Courier New" w:eastAsia="Times New Roman" w:hAnsi="Courier New" w:cs="Courier New"/>
+          <w:sz w:val="20"/>
+          <w:szCs w:val="20"/>
+        </w:rPr>
+        <w:t>cat.png</w:t>
+      </w:r>
+    </w:p>
+    <w:p>
+      <w:pPr>
+        <w:spacing w:before="100" w:beforeAutospacing="1" w:after="100" w:afterAutospacing="1" w:line="240" w:lineRule="auto"/>
+        <w:rPr>
+          <w:rFonts w:ascii="Times New Roman" w:eastAsia="Times New Roman" w:hAnsi="Times New Roman" w:cs="Times New Roman"/>
+          <w:sz w:val="24"/>
+          <w:szCs w:val="24"/>
+        </w:rPr>
+      </w:pPr>
+      <w:proofErr w:type="spellStart"/>
+      <w:r>
+        <w:rPr>
+          <w:rFonts w:ascii="Times New Roman" w:eastAsia="Times New Roman" w:hAnsi="Times New Roman" w:cs="Times New Roman"/>
+          <w:sz w:val="24"/>
+          <w:szCs w:val="24"/>
+        </w:rPr>
+        <w:t>Django</w:t>
+      </w:r>
+      <w:proofErr w:type="spellEnd"/>
+      <w:r>
+        <w:rPr>
+          <w:rFonts w:ascii="Times New Roman" w:eastAsia="Times New Roman" w:hAnsi="Times New Roman" w:cs="Times New Roman"/>
+          <w:sz w:val="24"/>
+          <w:szCs w:val="24"/>
+        </w:rPr>
+        <w:t xml:space="preserve"> stores it as</w:t>
+      </w:r>
+    </w:p>
+    <w:p>
+      <w:pPr>
+        <w:tabs>
+          <w:tab w:val="left" w:pos="916"/>
+          <w:tab w:val="left" w:pos="1832"/>
+          <w:tab w:val="left" w:pos="2748"/>
+          <w:tab w:val="left" w:pos="3664"/>
+          <w:tab w:val="left" w:pos="4580"/>
+          <w:tab w:val="left" w:pos="5496"/>
+          <w:tab w:val="left" w:pos="6412"/>
+          <w:tab w:val="left" w:pos="7328"/>
+          <w:tab w:val="left" w:pos="8244"/>
+          <w:tab w:val="left" w:pos="9160"/>
+          <w:tab w:val="left" w:pos="10076"/>
+          <w:tab w:val="left" w:pos="10992"/>
+          <w:tab w:val="left" w:pos="11908"/>
+          <w:tab w:val="left" w:pos="12824"/>
+          <w:tab w:val="left" w:pos="13740"/>
+          <w:tab w:val="left" w:pos="14656"/>
+        </w:tabs>
+        <w:spacing w:after="0" w:line="240" w:lineRule="auto"/>
+        <w:rPr>
+          <w:rFonts w:ascii="Courier New" w:eastAsia="Times New Roman" w:hAnsi="Courier New" w:cs="Courier New"/>
+          <w:sz w:val="20"/>
+          <w:szCs w:val="20"/>
+        </w:rPr>
+      </w:pPr>
+      <w:proofErr w:type="gramStart"/>
+      <w:r>
+        <w:rPr>
+          <w:rFonts w:ascii="Courier New" w:eastAsia="Times New Roman" w:hAnsi="Courier New" w:cs="Courier New"/>
+          <w:sz w:val="20"/>
+          <w:szCs w:val="20"/>
+        </w:rPr>
+        <w:t>media</w:t>
+      </w:r>
+      <w:proofErr w:type="gramEnd"/>
+      <w:r>
+        <w:rPr>
+          <w:rFonts w:ascii="Courier New" w:eastAsia="Times New Roman" w:hAnsi="Courier New" w:cs="Courier New"/>
+          <w:sz w:val="20"/>
+          <w:szCs w:val="20"/>
+        </w:rPr>
+        <w:t>/</w:t>
+      </w:r>
+    </w:p>
+    <w:p>
+      <w:pPr>
+        <w:tabs>
+          <w:tab w:val="left" w:pos="916"/>
+          <w:tab w:val="left" w:pos="1832"/>
+          <w:tab w:val="left" w:pos="2748"/>
+          <w:tab w:val="left" w:pos="3664"/>
+          <w:tab w:val="left" w:pos="4580"/>
+          <w:tab w:val="left" w:pos="5496"/>
+          <w:tab w:val="left" w:pos="6412"/>
+          <w:tab w:val="left" w:pos="7328"/>
+          <w:tab w:val="left" w:pos="8244"/>
+          <w:tab w:val="left" w:pos="9160"/>
+          <w:tab w:val="left" w:pos="10076"/>
+          <w:tab w:val="left" w:pos="10992"/>
+          <w:tab w:val="left" w:pos="11908"/>
+          <w:tab w:val="left" w:pos="12824"/>
+          <w:tab w:val="left" w:pos="13740"/>
+          <w:tab w:val="left" w:pos="14656"/>
+        </w:tabs>
+        <w:spacing w:after="0" w:line="240" w:lineRule="auto"/>
+        <w:rPr>
+          <w:rFonts w:ascii="Courier New" w:eastAsia="Times New Roman" w:hAnsi="Courier New" w:cs="Courier New"/>
+          <w:sz w:val="20"/>
+          <w:szCs w:val="20"/>
+        </w:rPr>
+      </w:pPr>
+      <w:r>
+        <w:rPr>
+          <w:rFonts w:ascii="Courier New" w:eastAsia="Times New Roman" w:hAnsi="Courier New" w:cs="Courier New"/>
+          <w:sz w:val="20"/>
+          <w:szCs w:val="20"/>
+        </w:rPr>
+        <w:t xml:space="preserve">    </w:t>
+      </w:r>
+      <w:proofErr w:type="gramStart"/>
+      <w:r>
+        <w:rPr>
+          <w:rFonts w:ascii="Courier New" w:eastAsia="Times New Roman" w:hAnsi="Courier New" w:cs="Courier New"/>
+          <w:sz w:val="20"/>
+          <w:szCs w:val="20"/>
+        </w:rPr>
+        <w:t>profiles</w:t>
+      </w:r>
+      <w:proofErr w:type="gramEnd"/>
+      <w:r>
+        <w:rPr>
+          <w:rFonts w:ascii="Courier New" w:eastAsia="Times New Roman" w:hAnsi="Courier New" w:cs="Courier New"/>
+          <w:sz w:val="20"/>
+          <w:szCs w:val="20"/>
+        </w:rPr>
+        <w:t>/</w:t>
+      </w:r>
+    </w:p>
+    <w:p>
+      <w:pPr>
+        <w:tabs>
+          <w:tab w:val="left" w:pos="916"/>
+          <w:tab w:val="left" w:pos="1832"/>
+          <w:tab w:val="left" w:pos="2748"/>
+          <w:tab w:val="left" w:pos="3664"/>
+          <w:tab w:val="left" w:pos="4580"/>
+          <w:tab w:val="left" w:pos="5496"/>
+          <w:tab w:val="left" w:pos="6412"/>
+          <w:tab w:val="left" w:pos="7328"/>
+          <w:tab w:val="left" w:pos="8244"/>
+          <w:tab w:val="left" w:pos="9160"/>
+          <w:tab w:val="left" w:pos="10076"/>
+          <w:tab w:val="left" w:pos="10992"/>
+          <w:tab w:val="left" w:pos="11908"/>
+          <w:tab w:val="left" w:pos="12824"/>
+          <w:tab w:val="left" w:pos="13740"/>
+          <w:tab w:val="left" w:pos="14656"/>
+        </w:tabs>
+        <w:spacing w:after="0" w:line="240" w:lineRule="auto"/>
+        <w:rPr>
+          <w:rFonts w:ascii="Courier New" w:eastAsia="Times New Roman" w:hAnsi="Courier New" w:cs="Courier New"/>
+          <w:sz w:val="20"/>
+          <w:szCs w:val="20"/>
+        </w:rPr>
+      </w:pPr>
+      <w:r>
+        <w:rPr>
+          <w:rFonts w:ascii="Courier New" w:eastAsia="Times New Roman" w:hAnsi="Courier New" w:cs="Courier New"/>
+          <w:sz w:val="20"/>
+          <w:szCs w:val="20"/>
+        </w:rPr>
+        <w:t xml:space="preserve">        cat.png</w:t>
+      </w:r>
+    </w:p>
+    <w:p>
+      <w:pPr>
+        <w:pStyle w:val="Heading1"/>
+      </w:pPr>
+      <w:proofErr w:type="gramStart"/>
+      <w:r>
+        <w:lastRenderedPageBreak/>
+        <w:t>4.</w:t>
+      </w:r>
+      <w:r>
+        <w:t>Configure</w:t>
+      </w:r>
+      <w:proofErr w:type="gramEnd"/>
+      <w:r>
+        <w:t xml:space="preserve"> Media</w:t>
+      </w:r>
+    </w:p>
+    <w:p>
+      <w:pPr>
+        <w:spacing w:before="100" w:beforeAutospacing="1" w:after="100" w:afterAutospacing="1" w:line="240" w:lineRule="auto"/>
+        <w:rPr>
+          <w:rFonts w:ascii="Times New Roman" w:eastAsia="Times New Roman" w:hAnsi="Times New Roman" w:cs="Times New Roman"/>
+          <w:sz w:val="24"/>
+          <w:szCs w:val="24"/>
+        </w:rPr>
+      </w:pPr>
+      <w:r>
+        <w:rPr>
+          <w:rFonts w:ascii="Times New Roman" w:eastAsia="Times New Roman" w:hAnsi="Times New Roman" w:cs="Times New Roman"/>
+          <w:sz w:val="24"/>
+          <w:szCs w:val="24"/>
+        </w:rPr>
+        <w:t xml:space="preserve">Inside </w:t>
+      </w:r>
+      <w:r>
+        <w:rPr>
+          <w:rFonts w:ascii="Courier New" w:eastAsia="Times New Roman" w:hAnsi="Courier New" w:cs="Courier New"/>
+          <w:sz w:val="20"/>
+        </w:rPr>
+        <w:t>settings.py</w:t>
+      </w:r>
+    </w:p>
+    <w:p>
+      <w:pPr>
+        <w:tabs>
+          <w:tab w:val="left" w:pos="916"/>
+          <w:tab w:val="left" w:pos="1832"/>
+          <w:tab w:val="left" w:pos="2748"/>
+          <w:tab w:val="left" w:pos="3664"/>
+          <w:tab w:val="left" w:pos="4580"/>
+          <w:tab w:val="left" w:pos="5496"/>
+          <w:tab w:val="left" w:pos="6412"/>
+          <w:tab w:val="left" w:pos="7328"/>
+          <w:tab w:val="left" w:pos="8244"/>
+          <w:tab w:val="left" w:pos="9160"/>
+          <w:tab w:val="left" w:pos="10076"/>
+          <w:tab w:val="left" w:pos="10992"/>
+          <w:tab w:val="left" w:pos="11908"/>
+          <w:tab w:val="left" w:pos="12824"/>
+          <w:tab w:val="left" w:pos="13740"/>
+          <w:tab w:val="left" w:pos="14656"/>
+        </w:tabs>
+        <w:spacing w:after="0" w:line="240" w:lineRule="auto"/>
+        <w:rPr>
+          <w:rFonts w:ascii="Courier New" w:eastAsia="Times New Roman" w:hAnsi="Courier New" w:cs="Courier New"/>
+          <w:color w:val="FF0000"/>
+          <w:sz w:val="20"/>
+        </w:rPr>
+      </w:pPr>
+      <w:r>
+        <w:rPr>
+          <w:rFonts w:ascii="Courier New" w:eastAsia="Times New Roman" w:hAnsi="Courier New" w:cs="Courier New"/>
+          <w:color w:val="FF0000"/>
+          <w:sz w:val="20"/>
+          <w:szCs w:val="20"/>
+        </w:rPr>
+        <w:t>MEDIA_URL</w:t>
+      </w:r>
+      <w:r>
+        <w:rPr>
+          <w:rFonts w:ascii="Courier New" w:eastAsia="Times New Roman" w:hAnsi="Courier New" w:cs="Courier New"/>
+          <w:color w:val="FF0000"/>
+          <w:sz w:val="20"/>
+        </w:rPr>
+        <w:t xml:space="preserve"> </w:t>
+      </w:r>
+      <w:r>
+        <w:rPr>
+          <w:rFonts w:ascii="Courier New" w:eastAsia="Times New Roman" w:hAnsi="Courier New" w:cs="Courier New"/>
+          <w:color w:val="FF0000"/>
+          <w:sz w:val="20"/>
+          <w:szCs w:val="20"/>
+        </w:rPr>
+        <w:t>=</w:t>
+      </w:r>
+      <w:r>
+        <w:rPr>
+          <w:rFonts w:ascii="Courier New" w:eastAsia="Times New Roman" w:hAnsi="Courier New" w:cs="Courier New"/>
+          <w:color w:val="FF0000"/>
+          <w:sz w:val="20"/>
+        </w:rPr>
+        <w:t xml:space="preserve"> </w:t>
+      </w:r>
+      <w:r>
+        <w:rPr>
+          <w:rFonts w:ascii="Courier New" w:eastAsia="Times New Roman" w:hAnsi="Courier New" w:cs="Courier New"/>
+          <w:color w:val="FF0000"/>
+          <w:sz w:val="20"/>
+          <w:szCs w:val="20"/>
+        </w:rPr>
+        <w:t>"/media/"</w:t>
+      </w:r>
+    </w:p>
+    <w:p>
+      <w:pPr>
+        <w:tabs>
+          <w:tab w:val="left" w:pos="916"/>
+          <w:tab w:val="left" w:pos="1832"/>
+          <w:tab w:val="left" w:pos="2748"/>
+          <w:tab w:val="left" w:pos="3664"/>
+          <w:tab w:val="left" w:pos="4580"/>
+          <w:tab w:val="left" w:pos="5496"/>
+          <w:tab w:val="left" w:pos="6412"/>
+          <w:tab w:val="left" w:pos="7328"/>
+          <w:tab w:val="left" w:pos="8244"/>
+          <w:tab w:val="left" w:pos="9160"/>
+          <w:tab w:val="left" w:pos="10076"/>
+          <w:tab w:val="left" w:pos="10992"/>
+          <w:tab w:val="left" w:pos="11908"/>
+          <w:tab w:val="left" w:pos="12824"/>
+          <w:tab w:val="left" w:pos="13740"/>
+          <w:tab w:val="left" w:pos="14656"/>
+        </w:tabs>
+        <w:spacing w:after="0" w:line="240" w:lineRule="auto"/>
+        <w:rPr>
+          <w:rFonts w:ascii="Courier New" w:eastAsia="Times New Roman" w:hAnsi="Courier New" w:cs="Courier New"/>
+          <w:color w:val="FF0000"/>
+          <w:sz w:val="20"/>
+          <w:szCs w:val="20"/>
+        </w:rPr>
+      </w:pPr>
+      <w:r>
+        <w:rPr>
+          <w:rFonts w:ascii="Courier New" w:eastAsia="Times New Roman" w:hAnsi="Courier New" w:cs="Courier New"/>
+          <w:color w:val="FF0000"/>
+          <w:sz w:val="20"/>
+          <w:szCs w:val="20"/>
+        </w:rPr>
+        <w:t>MEDIA_ROOT</w:t>
+      </w:r>
+      <w:r>
+        <w:rPr>
+          <w:rFonts w:ascii="Courier New" w:eastAsia="Times New Roman" w:hAnsi="Courier New" w:cs="Courier New"/>
+          <w:color w:val="FF0000"/>
+          <w:sz w:val="20"/>
+        </w:rPr>
+        <w:t xml:space="preserve"> </w:t>
+      </w:r>
+      <w:r>
+        <w:rPr>
+          <w:rFonts w:ascii="Courier New" w:eastAsia="Times New Roman" w:hAnsi="Courier New" w:cs="Courier New"/>
+          <w:color w:val="FF0000"/>
+          <w:sz w:val="20"/>
+          <w:szCs w:val="20"/>
+        </w:rPr>
+        <w:t>=</w:t>
+      </w:r>
+      <w:r>
+        <w:rPr>
+          <w:rFonts w:ascii="Courier New" w:eastAsia="Times New Roman" w:hAnsi="Courier New" w:cs="Courier New"/>
+          <w:color w:val="FF0000"/>
+          <w:sz w:val="20"/>
+        </w:rPr>
+        <w:t xml:space="preserve"> </w:t>
+      </w:r>
+      <w:r>
+        <w:rPr>
+          <w:rFonts w:ascii="Courier New" w:eastAsia="Times New Roman" w:hAnsi="Courier New" w:cs="Courier New"/>
+          <w:color w:val="FF0000"/>
+          <w:sz w:val="20"/>
+          <w:szCs w:val="20"/>
+        </w:rPr>
+        <w:t>BASE_DIR</w:t>
+      </w:r>
+      <w:r>
+        <w:rPr>
+          <w:rFonts w:ascii="Courier New" w:eastAsia="Times New Roman" w:hAnsi="Courier New" w:cs="Courier New"/>
+          <w:color w:val="FF0000"/>
+          <w:sz w:val="20"/>
+        </w:rPr>
+        <w:t xml:space="preserve"> </w:t>
+      </w:r>
+      <w:r>
+        <w:rPr>
+          <w:rFonts w:ascii="Courier New" w:eastAsia="Times New Roman" w:hAnsi="Courier New" w:cs="Courier New"/>
+          <w:color w:val="FF0000"/>
+          <w:sz w:val="20"/>
+          <w:szCs w:val="20"/>
+        </w:rPr>
+        <w:t>/</w:t>
+      </w:r>
+      <w:r>
+        <w:rPr>
+          <w:rFonts w:ascii="Courier New" w:eastAsia="Times New Roman" w:hAnsi="Courier New" w:cs="Courier New"/>
+          <w:color w:val="FF0000"/>
+          <w:sz w:val="20"/>
+        </w:rPr>
+        <w:t xml:space="preserve"> </w:t>
+      </w:r>
+      <w:r>
+        <w:rPr>
+          <w:rFonts w:ascii="Courier New" w:eastAsia="Times New Roman" w:hAnsi="Courier New" w:cs="Courier New"/>
+          <w:color w:val="FF0000"/>
+          <w:sz w:val="20"/>
+          <w:szCs w:val="20"/>
+        </w:rPr>
+        <w:t>"media"</w:t>
+      </w:r>
+    </w:p>
+    <w:p>
+      <w:pPr>
+        <w:spacing w:before="100" w:beforeAutospacing="1" w:after="100" w:afterAutospacing="1" w:line="240" w:lineRule="auto"/>
+        <w:rPr>
+          <w:rFonts w:ascii="Times New Roman" w:eastAsia="Times New Roman" w:hAnsi="Times New Roman" w:cs="Times New Roman"/>
+          <w:sz w:val="24"/>
+          <w:szCs w:val="24"/>
+        </w:rPr>
+      </w:pPr>
+      <w:r>
+        <w:rPr>
+          <w:rFonts w:ascii="Times New Roman" w:eastAsia="Times New Roman" w:hAnsi="Times New Roman" w:cs="Times New Roman"/>
+          <w:sz w:val="24"/>
+          <w:szCs w:val="24"/>
+        </w:rPr>
+        <w:t xml:space="preserve">This tells </w:t>
+      </w:r>
+      <w:proofErr w:type="spellStart"/>
+      <w:r>
+        <w:rPr>
+          <w:rFonts w:ascii="Times New Roman" w:eastAsia="Times New Roman" w:hAnsi="Times New Roman" w:cs="Times New Roman"/>
+          <w:sz w:val="24"/>
+          <w:szCs w:val="24"/>
+        </w:rPr>
+        <w:t>Django</w:t>
+      </w:r>
+      <w:proofErr w:type="spellEnd"/>
+      <w:r>
+        <w:rPr>
+          <w:rFonts w:ascii="Times New Roman" w:eastAsia="Times New Roman" w:hAnsi="Times New Roman" w:cs="Times New Roman"/>
+          <w:sz w:val="24"/>
+          <w:szCs w:val="24"/>
+        </w:rPr>
+        <w:t>:</w:t>
+      </w:r>
+    </w:p>
+    <w:p>
+      <w:pPr>
+        <w:tabs>
+          <w:tab w:val="left" w:pos="916"/>
+          <w:tab w:val="left" w:pos="1832"/>
+          <w:tab w:val="left" w:pos="2748"/>
+          <w:tab w:val="left" w:pos="3664"/>
+          <w:tab w:val="left" w:pos="4580"/>
+          <w:tab w:val="left" w:pos="5496"/>
+          <w:tab w:val="left" w:pos="6412"/>
+          <w:tab w:val="left" w:pos="7328"/>
+          <w:tab w:val="left" w:pos="8244"/>
+          <w:tab w:val="left" w:pos="9160"/>
+          <w:tab w:val="left" w:pos="10076"/>
+          <w:tab w:val="left" w:pos="10992"/>
+          <w:tab w:val="left" w:pos="11908"/>
+          <w:tab w:val="left" w:pos="12824"/>
+          <w:tab w:val="left" w:pos="13740"/>
+          <w:tab w:val="left" w:pos="14656"/>
+        </w:tabs>
+        <w:spacing w:after="0" w:line="240" w:lineRule="auto"/>
+        <w:rPr>
+          <w:rFonts w:ascii="Courier New" w:eastAsia="Times New Roman" w:hAnsi="Courier New" w:cs="Courier New"/>
+          <w:sz w:val="20"/>
+        </w:rPr>
+      </w:pPr>
+      <w:r>
+        <w:rPr>
+          <w:rFonts w:ascii="Courier New" w:eastAsia="Times New Roman" w:hAnsi="Courier New" w:cs="Courier New"/>
+          <w:sz w:val="20"/>
+        </w:rPr>
+        <w:t>Store uploaded files inside</w:t>
+      </w:r>
+    </w:p>
+    <w:p>
+      <w:pPr>
+        <w:tabs>
+          <w:tab w:val="left" w:pos="916"/>
+          <w:tab w:val="left" w:pos="1832"/>
+          <w:tab w:val="left" w:pos="2748"/>
+          <w:tab w:val="left" w:pos="3664"/>
+          <w:tab w:val="left" w:pos="4580"/>
+          <w:tab w:val="left" w:pos="5496"/>
+          <w:tab w:val="left" w:pos="6412"/>
+          <w:tab w:val="left" w:pos="7328"/>
+          <w:tab w:val="left" w:pos="8244"/>
+          <w:tab w:val="left" w:pos="9160"/>
+          <w:tab w:val="left" w:pos="10076"/>
+          <w:tab w:val="left" w:pos="10992"/>
+          <w:tab w:val="left" w:pos="11908"/>
+          <w:tab w:val="left" w:pos="12824"/>
+          <w:tab w:val="left" w:pos="13740"/>
+          <w:tab w:val="left" w:pos="14656"/>
+        </w:tabs>
+        <w:spacing w:after="0" w:line="240" w:lineRule="auto"/>
+        <w:rPr>
+          <w:rFonts w:ascii="Courier New" w:eastAsia="Times New Roman" w:hAnsi="Courier New" w:cs="Courier New"/>
+          <w:sz w:val="20"/>
+        </w:rPr>
+      </w:pPr>
+    </w:p>
+    <w:p>
+      <w:pPr>
+        <w:tabs>
+          <w:tab w:val="left" w:pos="916"/>
+          <w:tab w:val="left" w:pos="1832"/>
+          <w:tab w:val="left" w:pos="2748"/>
+          <w:tab w:val="left" w:pos="3664"/>
+          <w:tab w:val="left" w:pos="4580"/>
+          <w:tab w:val="left" w:pos="5496"/>
+          <w:tab w:val="left" w:pos="6412"/>
+          <w:tab w:val="left" w:pos="7328"/>
+          <w:tab w:val="left" w:pos="8244"/>
+          <w:tab w:val="left" w:pos="9160"/>
+          <w:tab w:val="left" w:pos="10076"/>
+          <w:tab w:val="left" w:pos="10992"/>
+          <w:tab w:val="left" w:pos="11908"/>
+          <w:tab w:val="left" w:pos="12824"/>
+          <w:tab w:val="left" w:pos="13740"/>
+          <w:tab w:val="left" w:pos="14656"/>
+        </w:tabs>
+        <w:spacing w:after="0" w:line="240" w:lineRule="auto"/>
+        <w:rPr>
+          <w:rFonts w:ascii="Courier New" w:eastAsia="Times New Roman" w:hAnsi="Courier New" w:cs="Courier New"/>
+          <w:sz w:val="20"/>
+        </w:rPr>
+      </w:pPr>
+      <w:proofErr w:type="gramStart"/>
+      <w:r>
+        <w:rPr>
+          <w:rFonts w:ascii="Courier New" w:eastAsia="Times New Roman" w:hAnsi="Courier New" w:cs="Courier New"/>
+          <w:sz w:val="20"/>
+        </w:rPr>
+        <w:t>media</w:t>
+      </w:r>
+      <w:proofErr w:type="gramEnd"/>
+      <w:r>
+        <w:rPr>
+          <w:rFonts w:ascii="Courier New" w:eastAsia="Times New Roman" w:hAnsi="Courier New" w:cs="Courier New"/>
+          <w:sz w:val="20"/>
+        </w:rPr>
+        <w:t>/</w:t>
+      </w:r>
+    </w:p>
+    <w:p>
+      <w:pPr>
+        <w:tabs>
+          <w:tab w:val="left" w:pos="916"/>
+          <w:tab w:val="left" w:pos="1832"/>
+          <w:tab w:val="left" w:pos="2748"/>
+          <w:tab w:val="left" w:pos="3664"/>
+          <w:tab w:val="left" w:pos="4580"/>
+          <w:tab w:val="left" w:pos="5496"/>
+          <w:tab w:val="left" w:pos="6412"/>
+          <w:tab w:val="left" w:pos="7328"/>
+          <w:tab w:val="left" w:pos="8244"/>
+          <w:tab w:val="left" w:pos="9160"/>
+          <w:tab w:val="left" w:pos="10076"/>
+          <w:tab w:val="left" w:pos="10992"/>
+          <w:tab w:val="left" w:pos="11908"/>
+          <w:tab w:val="left" w:pos="12824"/>
+          <w:tab w:val="left" w:pos="13740"/>
+          <w:tab w:val="left" w:pos="14656"/>
+        </w:tabs>
+        <w:spacing w:after="0" w:line="240" w:lineRule="auto"/>
+        <w:rPr>
+          <w:rFonts w:ascii="Courier New" w:eastAsia="Times New Roman" w:hAnsi="Courier New" w:cs="Courier New"/>
+          <w:sz w:val="20"/>
+        </w:rPr>
+      </w:pPr>
+    </w:p>
+    <w:p>
+      <w:pPr>
+        <w:pStyle w:val="Heading1"/>
+      </w:pPr>
+      <w:proofErr w:type="gramStart"/>
+      <w:r>
+        <w:t>5.</w:t>
+      </w:r>
+      <w:r>
+        <w:t>Update</w:t>
+      </w:r>
+      <w:proofErr w:type="gramEnd"/>
+      <w:r>
+        <w:t xml:space="preserve"> URLs</w:t>
+      </w:r>
+    </w:p>
+    <w:p>
+      <w:pPr>
+        <w:spacing w:before="100" w:beforeAutospacing="1" w:after="100" w:afterAutospacing="1" w:line="240" w:lineRule="auto"/>
+        <w:rPr>
+          <w:rFonts w:ascii="Times New Roman" w:eastAsia="Times New Roman" w:hAnsi="Times New Roman" w:cs="Times New Roman"/>
+          <w:sz w:val="24"/>
+          <w:szCs w:val="24"/>
+        </w:rPr>
+      </w:pPr>
+      <w:r>
+        <w:rPr>
+          <w:rFonts w:ascii="Times New Roman" w:eastAsia="Times New Roman" w:hAnsi="Times New Roman" w:cs="Times New Roman"/>
+          <w:sz w:val="24"/>
+          <w:szCs w:val="24"/>
+        </w:rPr>
+        <w:t xml:space="preserve">In your project's </w:t>
+      </w:r>
+      <w:r>
+        <w:rPr>
+          <w:rFonts w:ascii="Courier New" w:eastAsia="Times New Roman" w:hAnsi="Courier New" w:cs="Courier New"/>
+          <w:sz w:val="20"/>
+        </w:rPr>
+        <w:t>urls.py</w:t>
+      </w:r>
+      <w:r>
+        <w:rPr>
+          <w:rFonts w:ascii="Times New Roman" w:eastAsia="Times New Roman" w:hAnsi="Times New Roman" w:cs="Times New Roman"/>
+          <w:sz w:val="24"/>
+          <w:szCs w:val="24"/>
+        </w:rPr>
+        <w:t>:</w:t>
+      </w:r>
+    </w:p>
+    <w:p>
+      <w:pPr>
+        <w:tabs>
+          <w:tab w:val="left" w:pos="916"/>
+          <w:tab w:val="left" w:pos="1832"/>
+          <w:tab w:val="left" w:pos="2748"/>
+          <w:tab w:val="left" w:pos="3664"/>
+          <w:tab w:val="left" w:pos="4580"/>
+          <w:tab w:val="left" w:pos="5496"/>
+          <w:tab w:val="left" w:pos="6412"/>
+          <w:tab w:val="left" w:pos="7328"/>
+          <w:tab w:val="left" w:pos="8244"/>
+          <w:tab w:val="left" w:pos="9160"/>
+          <w:tab w:val="left" w:pos="10076"/>
+          <w:tab w:val="left" w:pos="10992"/>
+          <w:tab w:val="left" w:pos="11908"/>
+          <w:tab w:val="left" w:pos="12824"/>
+          <w:tab w:val="left" w:pos="13740"/>
+          <w:tab w:val="left" w:pos="14656"/>
+        </w:tabs>
+        <w:spacing w:after="0" w:line="240" w:lineRule="auto"/>
+        <w:rPr>
+          <w:rFonts w:ascii="Courier New" w:eastAsia="Times New Roman" w:hAnsi="Courier New" w:cs="Courier New"/>
+          <w:sz w:val="20"/>
+        </w:rPr>
+      </w:pPr>
+      <w:proofErr w:type="gramStart"/>
+      <w:r>
+        <w:rPr>
+          <w:rFonts w:ascii="Courier New" w:eastAsia="Times New Roman" w:hAnsi="Courier New" w:cs="Courier New"/>
+          <w:sz w:val="20"/>
+          <w:szCs w:val="20"/>
+        </w:rPr>
+        <w:t>from</w:t>
+      </w:r>
+      <w:proofErr w:type="gramEnd"/>
+      <w:r>
+        <w:rPr>
+          <w:rFonts w:ascii="Courier New" w:eastAsia="Times New Roman" w:hAnsi="Courier New" w:cs="Courier New"/>
+          <w:sz w:val="20"/>
+        </w:rPr>
+        <w:t xml:space="preserve"> </w:t>
+      </w:r>
+      <w:proofErr w:type="spellStart"/>
+      <w:r>
+        <w:rPr>
+          <w:rFonts w:ascii="Courier New" w:eastAsia="Times New Roman" w:hAnsi="Courier New" w:cs="Courier New"/>
+          <w:sz w:val="20"/>
+          <w:szCs w:val="20"/>
+        </w:rPr>
+        <w:t>django.conf</w:t>
+      </w:r>
+      <w:proofErr w:type="spellEnd"/>
+      <w:r>
+        <w:rPr>
+          <w:rFonts w:ascii="Courier New" w:eastAsia="Times New Roman" w:hAnsi="Courier New" w:cs="Courier New"/>
+          <w:sz w:val="20"/>
+        </w:rPr>
+        <w:t xml:space="preserve"> </w:t>
+      </w:r>
+      <w:r>
+        <w:rPr>
+          <w:rFonts w:ascii="Courier New" w:eastAsia="Times New Roman" w:hAnsi="Courier New" w:cs="Courier New"/>
+          <w:sz w:val="20"/>
+          <w:szCs w:val="20"/>
+        </w:rPr>
+        <w:t>import</w:t>
+      </w:r>
+      <w:r>
+        <w:rPr>
+          <w:rFonts w:ascii="Courier New" w:eastAsia="Times New Roman" w:hAnsi="Courier New" w:cs="Courier New"/>
+          <w:sz w:val="20"/>
+        </w:rPr>
+        <w:t xml:space="preserve"> </w:t>
+      </w:r>
+      <w:r>
+        <w:rPr>
+          <w:rFonts w:ascii="Courier New" w:eastAsia="Times New Roman" w:hAnsi="Courier New" w:cs="Courier New"/>
+          <w:sz w:val="20"/>
+          <w:szCs w:val="20"/>
+        </w:rPr>
+        <w:t>settings</w:t>
+      </w:r>
+    </w:p>
+    <w:p>
+      <w:pPr>
+        <w:tabs>
+          <w:tab w:val="left" w:pos="916"/>
+          <w:tab w:val="left" w:pos="1832"/>
+          <w:tab w:val="left" w:pos="2748"/>
+          <w:tab w:val="left" w:pos="3664"/>
+          <w:tab w:val="left" w:pos="4580"/>
+          <w:tab w:val="left" w:pos="5496"/>
+          <w:tab w:val="left" w:pos="6412"/>
+          <w:tab w:val="left" w:pos="7328"/>
+          <w:tab w:val="left" w:pos="8244"/>
+          <w:tab w:val="left" w:pos="9160"/>
+          <w:tab w:val="left" w:pos="10076"/>
+          <w:tab w:val="left" w:pos="10992"/>
+          <w:tab w:val="left" w:pos="11908"/>
+          <w:tab w:val="left" w:pos="12824"/>
+          <w:tab w:val="left" w:pos="13740"/>
+          <w:tab w:val="left" w:pos="14656"/>
+        </w:tabs>
+        <w:spacing w:after="0" w:line="240" w:lineRule="auto"/>
+        <w:rPr>
+          <w:rFonts w:ascii="Courier New" w:eastAsia="Times New Roman" w:hAnsi="Courier New" w:cs="Courier New"/>
+          <w:sz w:val="20"/>
+        </w:rPr>
+      </w:pPr>
+      <w:proofErr w:type="gramStart"/>
+      <w:r>
+        <w:rPr>
+          <w:rFonts w:ascii="Courier New" w:eastAsia="Times New Roman" w:hAnsi="Courier New" w:cs="Courier New"/>
+          <w:sz w:val="20"/>
+          <w:szCs w:val="20"/>
+        </w:rPr>
+        <w:t>from</w:t>
+      </w:r>
+      <w:proofErr w:type="gramEnd"/>
+      <w:r>
+        <w:rPr>
+          <w:rFonts w:ascii="Courier New" w:eastAsia="Times New Roman" w:hAnsi="Courier New" w:cs="Courier New"/>
+          <w:sz w:val="20"/>
+        </w:rPr>
+        <w:t xml:space="preserve"> </w:t>
+      </w:r>
+      <w:proofErr w:type="spellStart"/>
+      <w:r>
+        <w:rPr>
+          <w:rFonts w:ascii="Courier New" w:eastAsia="Times New Roman" w:hAnsi="Courier New" w:cs="Courier New"/>
+          <w:sz w:val="20"/>
+          <w:szCs w:val="20"/>
+        </w:rPr>
+        <w:t>django.conf.urls.static</w:t>
+      </w:r>
+      <w:proofErr w:type="spellEnd"/>
+      <w:r>
+        <w:rPr>
+          <w:rFonts w:ascii="Courier New" w:eastAsia="Times New Roman" w:hAnsi="Courier New" w:cs="Courier New"/>
+          <w:sz w:val="20"/>
+        </w:rPr>
+        <w:t xml:space="preserve"> </w:t>
+      </w:r>
+      <w:r>
+        <w:rPr>
+          <w:rFonts w:ascii="Courier New" w:eastAsia="Times New Roman" w:hAnsi="Courier New" w:cs="Courier New"/>
+          <w:sz w:val="20"/>
+          <w:szCs w:val="20"/>
+        </w:rPr>
+        <w:t>import</w:t>
+      </w:r>
+      <w:r>
+        <w:rPr>
+          <w:rFonts w:ascii="Courier New" w:eastAsia="Times New Roman" w:hAnsi="Courier New" w:cs="Courier New"/>
+          <w:sz w:val="20"/>
+        </w:rPr>
+        <w:t xml:space="preserve"> </w:t>
+      </w:r>
+      <w:r>
+        <w:rPr>
+          <w:rFonts w:ascii="Courier New" w:eastAsia="Times New Roman" w:hAnsi="Courier New" w:cs="Courier New"/>
+          <w:sz w:val="20"/>
+          <w:szCs w:val="20"/>
+        </w:rPr>
+        <w:t>static</w:t>
+      </w:r>
+    </w:p>
+    <w:p>
+      <w:pPr>
+        <w:tabs>
+          <w:tab w:val="left" w:pos="916"/>
+          <w:tab w:val="left" w:pos="1832"/>
+          <w:tab w:val="left" w:pos="2748"/>
+          <w:tab w:val="left" w:pos="3664"/>
+          <w:tab w:val="left" w:pos="4580"/>
+          <w:tab w:val="left" w:pos="5496"/>
+          <w:tab w:val="left" w:pos="6412"/>
+          <w:tab w:val="left" w:pos="7328"/>
+          <w:tab w:val="left" w:pos="8244"/>
+          <w:tab w:val="left" w:pos="9160"/>
+          <w:tab w:val="left" w:pos="10076"/>
+          <w:tab w:val="left" w:pos="10992"/>
+          <w:tab w:val="left" w:pos="11908"/>
+          <w:tab w:val="left" w:pos="12824"/>
+          <w:tab w:val="left" w:pos="13740"/>
+          <w:tab w:val="left" w:pos="14656"/>
+        </w:tabs>
+        <w:spacing w:after="0" w:line="240" w:lineRule="auto"/>
+        <w:rPr>
+          <w:rFonts w:ascii="Courier New" w:eastAsia="Times New Roman" w:hAnsi="Courier New" w:cs="Courier New"/>
+          <w:sz w:val="20"/>
+        </w:rPr>
+      </w:pPr>
+    </w:p>
+    <w:p>
+      <w:pPr>
+        <w:tabs>
+          <w:tab w:val="left" w:pos="916"/>
+          <w:tab w:val="left" w:pos="1832"/>
+          <w:tab w:val="left" w:pos="2748"/>
+          <w:tab w:val="left" w:pos="3664"/>
+          <w:tab w:val="left" w:pos="4580"/>
+          <w:tab w:val="left" w:pos="5496"/>
+          <w:tab w:val="left" w:pos="6412"/>
+          <w:tab w:val="left" w:pos="7328"/>
+          <w:tab w:val="left" w:pos="8244"/>
+          <w:tab w:val="left" w:pos="9160"/>
+          <w:tab w:val="left" w:pos="10076"/>
+          <w:tab w:val="left" w:pos="10992"/>
+          <w:tab w:val="left" w:pos="11908"/>
+          <w:tab w:val="left" w:pos="12824"/>
+          <w:tab w:val="left" w:pos="13740"/>
+          <w:tab w:val="left" w:pos="14656"/>
+        </w:tabs>
+        <w:spacing w:after="0" w:line="240" w:lineRule="auto"/>
+        <w:rPr>
+          <w:rFonts w:ascii="Courier New" w:eastAsia="Times New Roman" w:hAnsi="Courier New" w:cs="Courier New"/>
+          <w:sz w:val="20"/>
+        </w:rPr>
+      </w:pPr>
+      <w:proofErr w:type="spellStart"/>
+      <w:proofErr w:type="gramStart"/>
+      <w:r>
+        <w:rPr>
+          <w:rFonts w:ascii="Courier New" w:eastAsia="Times New Roman" w:hAnsi="Courier New" w:cs="Courier New"/>
+          <w:sz w:val="20"/>
+          <w:szCs w:val="20"/>
+        </w:rPr>
+        <w:t>urlpatterns</w:t>
+      </w:r>
+      <w:proofErr w:type="spellEnd"/>
+      <w:proofErr w:type="gramEnd"/>
+      <w:r>
+        <w:rPr>
+          <w:rFonts w:ascii="Courier New" w:eastAsia="Times New Roman" w:hAnsi="Courier New" w:cs="Courier New"/>
+          <w:sz w:val="20"/>
+        </w:rPr>
+        <w:t xml:space="preserve"> </w:t>
+      </w:r>
+      <w:r>
+        <w:rPr>
+          <w:rFonts w:ascii="Courier New" w:eastAsia="Times New Roman" w:hAnsi="Courier New" w:cs="Courier New"/>
+          <w:sz w:val="20"/>
+          <w:szCs w:val="20"/>
+        </w:rPr>
+        <w:t>=</w:t>
+      </w:r>
+      <w:r>
+        <w:rPr>
+          <w:rFonts w:ascii="Courier New" w:eastAsia="Times New Roman" w:hAnsi="Courier New" w:cs="Courier New"/>
+          <w:sz w:val="20"/>
+        </w:rPr>
+        <w:t xml:space="preserve"> [</w:t>
+      </w:r>
+    </w:p>
+    <w:p>
+      <w:pPr>
+        <w:tabs>
+          <w:tab w:val="left" w:pos="916"/>
+          <w:tab w:val="left" w:pos="1832"/>
+          <w:tab w:val="left" w:pos="2748"/>
+          <w:tab w:val="left" w:pos="3664"/>
+          <w:tab w:val="left" w:pos="4580"/>
+          <w:tab w:val="left" w:pos="5496"/>
+          <w:tab w:val="left" w:pos="6412"/>
+          <w:tab w:val="left" w:pos="7328"/>
+          <w:tab w:val="left" w:pos="8244"/>
+          <w:tab w:val="left" w:pos="9160"/>
+          <w:tab w:val="left" w:pos="10076"/>
+          <w:tab w:val="left" w:pos="10992"/>
+          <w:tab w:val="left" w:pos="11908"/>
+          <w:tab w:val="left" w:pos="12824"/>
+          <w:tab w:val="left" w:pos="13740"/>
+          <w:tab w:val="left" w:pos="14656"/>
+        </w:tabs>
+        <w:spacing w:after="0" w:line="240" w:lineRule="auto"/>
+        <w:rPr>
+          <w:rFonts w:ascii="Courier New" w:eastAsia="Times New Roman" w:hAnsi="Courier New" w:cs="Courier New"/>
+          <w:sz w:val="20"/>
+        </w:rPr>
+      </w:pPr>
+      <w:r>
+        <w:rPr>
+          <w:rFonts w:ascii="Courier New" w:eastAsia="Times New Roman" w:hAnsi="Courier New" w:cs="Courier New"/>
+          <w:sz w:val="20"/>
+        </w:rPr>
+        <w:t xml:space="preserve">    ...</w:t>
+      </w:r>
+    </w:p>
+    <w:p>
+      <w:pPr>
+        <w:tabs>
+          <w:tab w:val="left" w:pos="916"/>
+          <w:tab w:val="left" w:pos="1832"/>
+          <w:tab w:val="left" w:pos="2748"/>
+          <w:tab w:val="left" w:pos="3664"/>
+          <w:tab w:val="left" w:pos="4580"/>
+          <w:tab w:val="left" w:pos="5496"/>
+          <w:tab w:val="left" w:pos="6412"/>
+          <w:tab w:val="left" w:pos="7328"/>
+          <w:tab w:val="left" w:pos="8244"/>
+          <w:tab w:val="left" w:pos="9160"/>
+          <w:tab w:val="left" w:pos="10076"/>
+          <w:tab w:val="left" w:pos="10992"/>
+          <w:tab w:val="left" w:pos="11908"/>
+          <w:tab w:val="left" w:pos="12824"/>
+          <w:tab w:val="left" w:pos="13740"/>
+          <w:tab w:val="left" w:pos="14656"/>
+        </w:tabs>
+        <w:spacing w:after="0" w:line="240" w:lineRule="auto"/>
+        <w:rPr>
+          <w:rFonts w:ascii="Courier New" w:eastAsia="Times New Roman" w:hAnsi="Courier New" w:cs="Courier New"/>
+          <w:sz w:val="20"/>
+        </w:rPr>
+      </w:pPr>
+      <w:r>
+        <w:rPr>
+          <w:rFonts w:ascii="Courier New" w:eastAsia="Times New Roman" w:hAnsi="Courier New" w:cs="Courier New"/>
+          <w:sz w:val="20"/>
+        </w:rPr>
+        <w:t>]</w:t>
+      </w:r>
+    </w:p>
+    <w:p>
+      <w:pPr>
+        <w:tabs>
+          <w:tab w:val="left" w:pos="916"/>
+          <w:tab w:val="left" w:pos="1832"/>
+          <w:tab w:val="left" w:pos="2748"/>
+          <w:tab w:val="left" w:pos="3664"/>
+          <w:tab w:val="left" w:pos="4580"/>
+          <w:tab w:val="left" w:pos="5496"/>
+          <w:tab w:val="left" w:pos="6412"/>
+          <w:tab w:val="left" w:pos="7328"/>
+          <w:tab w:val="left" w:pos="8244"/>
+          <w:tab w:val="left" w:pos="9160"/>
+          <w:tab w:val="left" w:pos="10076"/>
+          <w:tab w:val="left" w:pos="10992"/>
+          <w:tab w:val="left" w:pos="11908"/>
+          <w:tab w:val="left" w:pos="12824"/>
+          <w:tab w:val="left" w:pos="13740"/>
+          <w:tab w:val="left" w:pos="14656"/>
+        </w:tabs>
+        <w:spacing w:after="0" w:line="240" w:lineRule="auto"/>
+        <w:rPr>
+          <w:rFonts w:ascii="Courier New" w:eastAsia="Times New Roman" w:hAnsi="Courier New" w:cs="Courier New"/>
+          <w:sz w:val="20"/>
+        </w:rPr>
+      </w:pPr>
+    </w:p>
+    <w:p>
+      <w:pPr>
+        <w:tabs>
+          <w:tab w:val="left" w:pos="916"/>
+          <w:tab w:val="left" w:pos="1832"/>
+          <w:tab w:val="left" w:pos="2748"/>
+          <w:tab w:val="left" w:pos="3664"/>
+          <w:tab w:val="left" w:pos="4580"/>
+          <w:tab w:val="left" w:pos="5496"/>
+          <w:tab w:val="left" w:pos="6412"/>
+          <w:tab w:val="left" w:pos="7328"/>
+          <w:tab w:val="left" w:pos="8244"/>
+          <w:tab w:val="left" w:pos="9160"/>
+          <w:tab w:val="left" w:pos="10076"/>
+          <w:tab w:val="left" w:pos="10992"/>
+          <w:tab w:val="left" w:pos="11908"/>
+          <w:tab w:val="left" w:pos="12824"/>
+          <w:tab w:val="left" w:pos="13740"/>
+          <w:tab w:val="left" w:pos="14656"/>
+        </w:tabs>
+        <w:spacing w:after="0" w:line="240" w:lineRule="auto"/>
+        <w:rPr>
+          <w:rFonts w:ascii="Courier New" w:eastAsia="Times New Roman" w:hAnsi="Courier New" w:cs="Courier New"/>
+          <w:color w:val="FF0000"/>
+          <w:sz w:val="20"/>
+        </w:rPr>
+      </w:pPr>
+      <w:proofErr w:type="gramStart"/>
+      <w:r>
+        <w:rPr>
+          <w:rFonts w:ascii="Courier New" w:eastAsia="Times New Roman" w:hAnsi="Courier New" w:cs="Courier New"/>
+          <w:color w:val="FF0000"/>
+          <w:sz w:val="20"/>
+          <w:szCs w:val="20"/>
+        </w:rPr>
+        <w:t>if</w:t>
+      </w:r>
+      <w:proofErr w:type="gramEnd"/>
+      <w:r>
+        <w:rPr>
+          <w:rFonts w:ascii="Courier New" w:eastAsia="Times New Roman" w:hAnsi="Courier New" w:cs="Courier New"/>
+          <w:color w:val="FF0000"/>
+          <w:sz w:val="20"/>
+        </w:rPr>
+        <w:t xml:space="preserve"> </w:t>
+      </w:r>
+      <w:proofErr w:type="spellStart"/>
+      <w:r>
+        <w:rPr>
+          <w:rFonts w:ascii="Courier New" w:eastAsia="Times New Roman" w:hAnsi="Courier New" w:cs="Courier New"/>
+          <w:color w:val="FF0000"/>
+          <w:sz w:val="20"/>
+          <w:szCs w:val="20"/>
+        </w:rPr>
+        <w:t>settings.</w:t>
+      </w:r>
+      <w:r>
+        <w:rPr>
+          <w:rFonts w:ascii="Courier New" w:eastAsia="Times New Roman" w:hAnsi="Courier New" w:cs="Courier New"/>
+          <w:color w:val="FF0000"/>
+          <w:sz w:val="20"/>
+        </w:rPr>
+        <w:t>DEBUG</w:t>
+      </w:r>
+      <w:proofErr w:type="spellEnd"/>
+      <w:r>
+        <w:rPr>
+          <w:rFonts w:ascii="Courier New" w:eastAsia="Times New Roman" w:hAnsi="Courier New" w:cs="Courier New"/>
+          <w:color w:val="FF0000"/>
+          <w:sz w:val="20"/>
+        </w:rPr>
+        <w:t>:</w:t>
+      </w:r>
+    </w:p>
+    <w:p>
+      <w:pPr>
+        <w:tabs>
+          <w:tab w:val="left" w:pos="916"/>
+          <w:tab w:val="left" w:pos="1832"/>
+          <w:tab w:val="left" w:pos="2748"/>
+          <w:tab w:val="left" w:pos="3664"/>
+          <w:tab w:val="left" w:pos="4580"/>
+          <w:tab w:val="left" w:pos="5496"/>
+          <w:tab w:val="left" w:pos="6412"/>
+          <w:tab w:val="left" w:pos="7328"/>
+          <w:tab w:val="left" w:pos="8244"/>
+          <w:tab w:val="left" w:pos="9160"/>
+          <w:tab w:val="left" w:pos="10076"/>
+          <w:tab w:val="left" w:pos="10992"/>
+          <w:tab w:val="left" w:pos="11908"/>
+          <w:tab w:val="left" w:pos="12824"/>
+          <w:tab w:val="left" w:pos="13740"/>
+          <w:tab w:val="left" w:pos="14656"/>
+        </w:tabs>
+        <w:spacing w:after="0" w:line="240" w:lineRule="auto"/>
+        <w:rPr>
+          <w:rFonts w:ascii="Courier New" w:eastAsia="Times New Roman" w:hAnsi="Courier New" w:cs="Courier New"/>
+          <w:color w:val="FF0000"/>
+          <w:sz w:val="20"/>
+          <w:szCs w:val="20"/>
+        </w:rPr>
+      </w:pPr>
+      <w:r>
+        <w:rPr>
+          <w:rFonts w:ascii="Courier New" w:eastAsia="Times New Roman" w:hAnsi="Courier New" w:cs="Courier New"/>
+          <w:color w:val="FF0000"/>
+          <w:sz w:val="20"/>
+        </w:rPr>
+        <w:t xml:space="preserve">    </w:t>
+      </w:r>
+      <w:proofErr w:type="spellStart"/>
+      <w:proofErr w:type="gramStart"/>
+      <w:r>
+        <w:rPr>
+          <w:rFonts w:ascii="Courier New" w:eastAsia="Times New Roman" w:hAnsi="Courier New" w:cs="Courier New"/>
+          <w:color w:val="FF0000"/>
+          <w:sz w:val="20"/>
+          <w:szCs w:val="20"/>
+        </w:rPr>
+        <w:t>urlpatterns</w:t>
+      </w:r>
+      <w:proofErr w:type="spellEnd"/>
+      <w:proofErr w:type="gramEnd"/>
+      <w:r>
+        <w:rPr>
+          <w:rFonts w:ascii="Courier New" w:eastAsia="Times New Roman" w:hAnsi="Courier New" w:cs="Courier New"/>
+          <w:color w:val="FF0000"/>
+          <w:sz w:val="20"/>
+        </w:rPr>
+        <w:t xml:space="preserve"> </w:t>
+      </w:r>
+      <w:r>
+        <w:rPr>
+          <w:rFonts w:ascii="Courier New" w:eastAsia="Times New Roman" w:hAnsi="Courier New" w:cs="Courier New"/>
+          <w:color w:val="FF0000"/>
+          <w:sz w:val="20"/>
+          <w:szCs w:val="20"/>
+        </w:rPr>
+        <w:t>+=</w:t>
+      </w:r>
+      <w:r>
+        <w:rPr>
+          <w:rFonts w:ascii="Courier New" w:eastAsia="Times New Roman" w:hAnsi="Courier New" w:cs="Courier New"/>
+          <w:color w:val="FF0000"/>
+          <w:sz w:val="20"/>
+        </w:rPr>
+        <w:t xml:space="preserve"> </w:t>
+      </w:r>
+      <w:r>
+        <w:rPr>
+          <w:rFonts w:ascii="Courier New" w:eastAsia="Times New Roman" w:hAnsi="Courier New" w:cs="Courier New"/>
+          <w:color w:val="FF0000"/>
+          <w:sz w:val="20"/>
+          <w:szCs w:val="20"/>
+        </w:rPr>
+        <w:t>static</w:t>
+      </w:r>
+      <w:r>
+        <w:rPr>
+          <w:rFonts w:ascii="Courier New" w:eastAsia="Times New Roman" w:hAnsi="Courier New" w:cs="Courier New"/>
+          <w:color w:val="FF0000"/>
+          <w:sz w:val="20"/>
+        </w:rPr>
+        <w:t>(</w:t>
+      </w:r>
+      <w:proofErr w:type="spellStart"/>
+      <w:r>
+        <w:rPr>
+          <w:rFonts w:ascii="Courier New" w:eastAsia="Times New Roman" w:hAnsi="Courier New" w:cs="Courier New"/>
+          <w:color w:val="FF0000"/>
+          <w:sz w:val="20"/>
+          <w:szCs w:val="20"/>
+        </w:rPr>
+        <w:t>settings.</w:t>
+      </w:r>
+      <w:r>
+        <w:rPr>
+          <w:rFonts w:ascii="Courier New" w:eastAsia="Times New Roman" w:hAnsi="Courier New" w:cs="Courier New"/>
+          <w:color w:val="FF0000"/>
+          <w:sz w:val="20"/>
+        </w:rPr>
+        <w:t>MEDIA_URL</w:t>
+      </w:r>
+      <w:proofErr w:type="spellEnd"/>
+      <w:r>
+        <w:rPr>
+          <w:rFonts w:ascii="Courier New" w:eastAsia="Times New Roman" w:hAnsi="Courier New" w:cs="Courier New"/>
+          <w:color w:val="FF0000"/>
+          <w:sz w:val="20"/>
+        </w:rPr>
+        <w:t xml:space="preserve">, </w:t>
+      </w:r>
+      <w:proofErr w:type="spellStart"/>
+      <w:r>
+        <w:rPr>
+          <w:rFonts w:ascii="Courier New" w:eastAsia="Times New Roman" w:hAnsi="Courier New" w:cs="Courier New"/>
+          <w:color w:val="FF0000"/>
+          <w:sz w:val="20"/>
+          <w:szCs w:val="20"/>
+        </w:rPr>
+        <w:t>document_root</w:t>
+      </w:r>
+      <w:proofErr w:type="spellEnd"/>
+      <w:r>
+        <w:rPr>
+          <w:rFonts w:ascii="Courier New" w:eastAsia="Times New Roman" w:hAnsi="Courier New" w:cs="Courier New"/>
+          <w:color w:val="FF0000"/>
+          <w:sz w:val="20"/>
+          <w:szCs w:val="20"/>
+        </w:rPr>
+        <w:t>=</w:t>
+      </w:r>
+      <w:proofErr w:type="spellStart"/>
+      <w:r>
+        <w:rPr>
+          <w:rFonts w:ascii="Courier New" w:eastAsia="Times New Roman" w:hAnsi="Courier New" w:cs="Courier New"/>
+          <w:color w:val="FF0000"/>
+          <w:sz w:val="20"/>
+          <w:szCs w:val="20"/>
+        </w:rPr>
+        <w:t>settings.</w:t>
+      </w:r>
+      <w:r>
+        <w:rPr>
+          <w:rFonts w:ascii="Courier New" w:eastAsia="Times New Roman" w:hAnsi="Courier New" w:cs="Courier New"/>
+          <w:color w:val="FF0000"/>
+          <w:sz w:val="20"/>
+        </w:rPr>
+        <w:t>MEDIA_ROOT</w:t>
+      </w:r>
+      <w:proofErr w:type="spellEnd"/>
+      <w:r>
+        <w:rPr>
+          <w:rFonts w:ascii="Courier New" w:eastAsia="Times New Roman" w:hAnsi="Courier New" w:cs="Courier New"/>
+          <w:color w:val="FF0000"/>
+          <w:sz w:val="20"/>
+        </w:rPr>
+        <w:t>)</w:t>
+      </w:r>
+    </w:p>
+    <w:p>
+      <w:pPr>
+        <w:spacing w:before="100" w:beforeAutospacing="1" w:after="100" w:afterAutospacing="1" w:line="240" w:lineRule="auto"/>
+        <w:rPr>
+          <w:rFonts w:ascii="Times New Roman" w:eastAsia="Times New Roman" w:hAnsi="Times New Roman" w:cs="Times New Roman"/>
+          <w:sz w:val="24"/>
+          <w:szCs w:val="24"/>
+        </w:rPr>
+      </w:pPr>
+      <w:r>
+        <w:rPr>
+          <w:rFonts w:ascii="Times New Roman" w:eastAsia="Times New Roman" w:hAnsi="Times New Roman" w:cs="Times New Roman"/>
+          <w:sz w:val="24"/>
+          <w:szCs w:val="24"/>
+        </w:rPr>
+        <w:t>Without this, uploaded files won't be served during development.</w:t>
+      </w:r>
+    </w:p>
+    <w:p>
+      <w:pPr>
+        <w:tabs>
+          <w:tab w:val="left" w:pos="916"/>
+          <w:tab w:val="left" w:pos="1832"/>
+          <w:tab w:val="left" w:pos="2748"/>
+          <w:tab w:val="left" w:pos="3664"/>
+          <w:tab w:val="left" w:pos="4580"/>
+          <w:tab w:val="left" w:pos="5496"/>
+          <w:tab w:val="left" w:pos="6412"/>
+          <w:tab w:val="left" w:pos="7328"/>
+          <w:tab w:val="left" w:pos="8244"/>
+          <w:tab w:val="left" w:pos="9160"/>
+          <w:tab w:val="left" w:pos="10076"/>
+          <w:tab w:val="left" w:pos="10992"/>
+          <w:tab w:val="left" w:pos="11908"/>
+          <w:tab w:val="left" w:pos="12824"/>
+          <w:tab w:val="left" w:pos="13740"/>
+          <w:tab w:val="left" w:pos="14656"/>
+        </w:tabs>
+        <w:spacing w:after="0" w:line="240" w:lineRule="auto"/>
+        <w:rPr>
+          <w:rFonts w:ascii="Times New Roman" w:eastAsia="Times New Roman" w:hAnsi="Times New Roman" w:cs="Times New Roman"/>
+          <w:b/>
+          <w:sz w:val="40"/>
+          <w:szCs w:val="20"/>
+        </w:rPr>
+      </w:pPr>
+      <w:proofErr w:type="gramStart"/>
+      <w:r>
+        <w:rPr>
+          <w:rFonts w:ascii="Times New Roman" w:eastAsia="Times New Roman" w:hAnsi="Times New Roman" w:cs="Times New Roman"/>
+          <w:b/>
+          <w:sz w:val="40"/>
+          <w:szCs w:val="20"/>
+        </w:rPr>
+        <w:t>6.</w:t>
+      </w:r>
+      <w:r>
+        <w:rPr>
+          <w:rFonts w:ascii="Times New Roman" w:eastAsia="Times New Roman" w:hAnsi="Times New Roman" w:cs="Times New Roman"/>
+          <w:b/>
+          <w:sz w:val="40"/>
+          <w:szCs w:val="20"/>
+        </w:rPr>
+        <w:t>Same</w:t>
+      </w:r>
+      <w:proofErr w:type="gramEnd"/>
+      <w:r>
+        <w:rPr>
+          <w:rFonts w:ascii="Times New Roman" w:eastAsia="Times New Roman" w:hAnsi="Times New Roman" w:cs="Times New Roman"/>
+          <w:b/>
+          <w:sz w:val="40"/>
+          <w:szCs w:val="20"/>
+        </w:rPr>
+        <w:t xml:space="preserve"> view(</w:t>
+      </w:r>
+      <w:proofErr w:type="spellStart"/>
+      <w:r>
+        <w:rPr>
+          <w:rFonts w:ascii="Times New Roman" w:eastAsia="Times New Roman" w:hAnsi="Times New Roman" w:cs="Times New Roman"/>
+          <w:b/>
+          <w:sz w:val="40"/>
+          <w:szCs w:val="20"/>
+        </w:rPr>
+        <w:t>modelviewset</w:t>
+      </w:r>
+      <w:proofErr w:type="spellEnd"/>
+      <w:r>
+        <w:rPr>
+          <w:rFonts w:ascii="Times New Roman" w:eastAsia="Times New Roman" w:hAnsi="Times New Roman" w:cs="Times New Roman"/>
+          <w:b/>
+          <w:sz w:val="40"/>
+          <w:szCs w:val="20"/>
+        </w:rPr>
+        <w:t>),</w:t>
+      </w:r>
+    </w:p>
+    <w:p>
+      <w:pPr>
+        <w:tabs>
+          <w:tab w:val="left" w:pos="916"/>
+          <w:tab w:val="left" w:pos="1832"/>
+          <w:tab w:val="left" w:pos="2748"/>
+          <w:tab w:val="left" w:pos="3664"/>
+          <w:tab w:val="left" w:pos="4580"/>
+          <w:tab w:val="left" w:pos="5496"/>
+          <w:tab w:val="left" w:pos="6412"/>
+          <w:tab w:val="left" w:pos="7328"/>
+          <w:tab w:val="left" w:pos="8244"/>
+          <w:tab w:val="left" w:pos="9160"/>
+          <w:tab w:val="left" w:pos="10076"/>
+          <w:tab w:val="left" w:pos="10992"/>
+          <w:tab w:val="left" w:pos="11908"/>
+          <w:tab w:val="left" w:pos="12824"/>
+          <w:tab w:val="left" w:pos="13740"/>
+          <w:tab w:val="left" w:pos="14656"/>
+        </w:tabs>
+        <w:spacing w:after="0" w:line="240" w:lineRule="auto"/>
+        <w:rPr>
+          <w:rFonts w:ascii="Times New Roman" w:eastAsia="Times New Roman" w:hAnsi="Times New Roman" w:cs="Times New Roman"/>
+          <w:b/>
+          <w:sz w:val="40"/>
+          <w:szCs w:val="20"/>
+        </w:rPr>
+      </w:pPr>
+      <w:proofErr w:type="spellStart"/>
+      <w:proofErr w:type="gramStart"/>
+      <w:r>
+        <w:rPr>
+          <w:rFonts w:ascii="Times New Roman" w:eastAsia="Times New Roman" w:hAnsi="Times New Roman" w:cs="Times New Roman"/>
+          <w:b/>
+          <w:sz w:val="40"/>
+          <w:szCs w:val="20"/>
+        </w:rPr>
+        <w:t>serializer</w:t>
+      </w:r>
+      <w:proofErr w:type="gramEnd"/>
+      <w:r>
+        <w:rPr>
+          <w:rFonts w:ascii="Times New Roman" w:eastAsia="Times New Roman" w:hAnsi="Times New Roman" w:cs="Times New Roman"/>
+          <w:b/>
+          <w:sz w:val="40"/>
+          <w:szCs w:val="20"/>
+        </w:rPr>
+        <w:t>,</w:t>
+      </w:r>
+      <w:proofErr w:type="spellEnd"/>
+    </w:p>
+    <w:p>
+      <w:pPr>
+        <w:tabs>
+          <w:tab w:val="left" w:pos="916"/>
+          <w:tab w:val="left" w:pos="1832"/>
+          <w:tab w:val="left" w:pos="2748"/>
+          <w:tab w:val="left" w:pos="3664"/>
+          <w:tab w:val="left" w:pos="4580"/>
+          <w:tab w:val="left" w:pos="5496"/>
+          <w:tab w:val="left" w:pos="6412"/>
+          <w:tab w:val="left" w:pos="7328"/>
+          <w:tab w:val="left" w:pos="8244"/>
+          <w:tab w:val="left" w:pos="9160"/>
+          <w:tab w:val="left" w:pos="10076"/>
+          <w:tab w:val="left" w:pos="10992"/>
+          <w:tab w:val="left" w:pos="11908"/>
+          <w:tab w:val="left" w:pos="12824"/>
+          <w:tab w:val="left" w:pos="13740"/>
+          <w:tab w:val="left" w:pos="14656"/>
+        </w:tabs>
+        <w:spacing w:after="0" w:line="240" w:lineRule="auto"/>
+        <w:rPr>
+          <w:rFonts w:ascii="Times New Roman" w:eastAsia="Times New Roman" w:hAnsi="Times New Roman" w:cs="Times New Roman"/>
+          <w:b/>
+          <w:sz w:val="40"/>
+          <w:szCs w:val="20"/>
+        </w:rPr>
+      </w:pPr>
+      <w:proofErr w:type="spellStart"/>
+      <w:proofErr w:type="gramStart"/>
+      <w:r>
+        <w:rPr>
+          <w:rFonts w:ascii="Times New Roman" w:eastAsia="Times New Roman" w:hAnsi="Times New Roman" w:cs="Times New Roman"/>
+          <w:b/>
+          <w:sz w:val="40"/>
+          <w:szCs w:val="20"/>
+        </w:rPr>
+        <w:t>url</w:t>
+      </w:r>
+      <w:proofErr w:type="spellEnd"/>
+      <w:r>
+        <w:rPr>
+          <w:rFonts w:ascii="Times New Roman" w:eastAsia="Times New Roman" w:hAnsi="Times New Roman" w:cs="Times New Roman"/>
+          <w:b/>
+          <w:sz w:val="40"/>
+          <w:szCs w:val="20"/>
+        </w:rPr>
+        <w:t>(</w:t>
+      </w:r>
+      <w:proofErr w:type="gramEnd"/>
+      <w:r>
+        <w:rPr>
+          <w:rFonts w:ascii="Times New Roman" w:eastAsia="Times New Roman" w:hAnsi="Times New Roman" w:cs="Times New Roman"/>
+          <w:b/>
+          <w:sz w:val="40"/>
+          <w:szCs w:val="20"/>
+        </w:rPr>
+        <w:t>router)</w:t>
+      </w:r>
+    </w:p>
+    <w:p>
+      <w:pPr>
+        <w:tabs>
+          <w:tab w:val="left" w:pos="916"/>
+          <w:tab w:val="left" w:pos="1832"/>
+          <w:tab w:val="left" w:pos="2748"/>
+          <w:tab w:val="left" w:pos="3664"/>
+          <w:tab w:val="left" w:pos="4580"/>
+          <w:tab w:val="left" w:pos="5496"/>
+          <w:tab w:val="left" w:pos="6412"/>
+          <w:tab w:val="left" w:pos="7328"/>
+          <w:tab w:val="left" w:pos="8244"/>
+          <w:tab w:val="left" w:pos="9160"/>
+          <w:tab w:val="left" w:pos="10076"/>
+          <w:tab w:val="left" w:pos="10992"/>
+          <w:tab w:val="left" w:pos="11908"/>
+          <w:tab w:val="left" w:pos="12824"/>
+          <w:tab w:val="left" w:pos="13740"/>
+          <w:tab w:val="left" w:pos="14656"/>
+        </w:tabs>
+        <w:spacing w:after="0" w:line="240" w:lineRule="auto"/>
+        <w:jc w:val="center"/>
+        <w:rPr>
+          <w:rFonts w:ascii="Times New Roman" w:eastAsia="Times New Roman" w:hAnsi="Times New Roman" w:cs="Times New Roman"/>
+          <w:b/>
+          <w:color w:val="FF0000"/>
+          <w:sz w:val="40"/>
+          <w:szCs w:val="20"/>
+          <w:u w:val="single"/>
+        </w:rPr>
+      </w:pPr>
+      <w:r>
+        <w:rPr>
+          <w:rFonts w:ascii="Times New Roman" w:eastAsia="Times New Roman" w:hAnsi="Times New Roman" w:cs="Times New Roman"/>
+          <w:b/>
+          <w:color w:val="FF0000"/>
+          <w:sz w:val="44"/>
+          <w:szCs w:val="20"/>
+          <w:u w:val="single"/>
+        </w:rPr>
+        <w:t>Authentication</w:t>
+      </w:r>
+    </w:p>
+    <w:p>
+      <w:pPr>
+        <w:tabs>
+          <w:tab w:val="left" w:pos="916"/>
+          <w:tab w:val="left" w:pos="1832"/>
+          <w:tab w:val="left" w:pos="2748"/>
+          <w:tab w:val="left" w:pos="3664"/>
+          <w:tab w:val="left" w:pos="4580"/>
+          <w:tab w:val="left" w:pos="5496"/>
+          <w:tab w:val="left" w:pos="6412"/>
+          <w:tab w:val="left" w:pos="7328"/>
+          <w:tab w:val="left" w:pos="8244"/>
+          <w:tab w:val="left" w:pos="9160"/>
+          <w:tab w:val="left" w:pos="10076"/>
+          <w:tab w:val="left" w:pos="10992"/>
+          <w:tab w:val="left" w:pos="11908"/>
+          <w:tab w:val="left" w:pos="12824"/>
+          <w:tab w:val="left" w:pos="13740"/>
+          <w:tab w:val="left" w:pos="14656"/>
+        </w:tabs>
+        <w:spacing w:after="0" w:line="240" w:lineRule="auto"/>
+        <w:rPr>
+          <w:rFonts w:ascii="Times New Roman" w:eastAsia="Times New Roman" w:hAnsi="Times New Roman" w:cs="Times New Roman"/>
+          <w:b/>
+          <w:sz w:val="40"/>
+          <w:szCs w:val="20"/>
+        </w:rPr>
+      </w:pPr>
+    </w:p>
+    <w:p>
+      <w:pPr>
+        <w:tabs>
+          <w:tab w:val="left" w:pos="916"/>
+          <w:tab w:val="left" w:pos="1832"/>
+          <w:tab w:val="left" w:pos="2748"/>
+          <w:tab w:val="left" w:pos="3664"/>
+          <w:tab w:val="left" w:pos="4580"/>
+          <w:tab w:val="left" w:pos="5496"/>
+          <w:tab w:val="left" w:pos="6412"/>
+          <w:tab w:val="left" w:pos="7328"/>
+          <w:tab w:val="left" w:pos="8244"/>
+          <w:tab w:val="left" w:pos="9160"/>
+          <w:tab w:val="left" w:pos="10076"/>
+          <w:tab w:val="left" w:pos="10992"/>
+          <w:tab w:val="left" w:pos="11908"/>
+          <w:tab w:val="left" w:pos="12824"/>
+          <w:tab w:val="left" w:pos="13740"/>
+          <w:tab w:val="left" w:pos="14656"/>
+        </w:tabs>
+        <w:spacing w:after="0" w:line="240" w:lineRule="auto"/>
+        <w:rPr>
+          <w:rFonts w:ascii="Times New Roman" w:eastAsia="Times New Roman" w:hAnsi="Times New Roman" w:cs="Times New Roman"/>
+          <w:b/>
+          <w:sz w:val="40"/>
+          <w:szCs w:val="20"/>
+        </w:rPr>
+      </w:pPr>
+      <w:r>
+        <w:rPr>
+          <w:rFonts w:ascii="Times New Roman" w:eastAsia="Times New Roman" w:hAnsi="Times New Roman" w:cs="Times New Roman"/>
+          <w:b/>
+          <w:sz w:val="40"/>
+          <w:szCs w:val="20"/>
+        </w:rPr>
+        <w:t>1.</w:t>
+      </w:r>
+      <w:r>
+        <w:rPr>
+          <w:rFonts w:ascii="Times New Roman" w:eastAsia="Times New Roman" w:hAnsi="Times New Roman" w:cs="Times New Roman"/>
+          <w:b/>
+          <w:sz w:val="40"/>
+          <w:szCs w:val="20"/>
+        </w:rPr>
+        <w:t>Build a Session Authentication API with:</w:t>
+      </w:r>
+      <w:r>
+        <w:rPr>
+          <w:rFonts w:ascii="Times New Roman" w:eastAsia="Times New Roman" w:hAnsi="Times New Roman" w:cs="Times New Roman"/>
+          <w:b/>
+          <w:sz w:val="40"/>
+          <w:szCs w:val="20"/>
+        </w:rPr>
+        <w:t>Feature-</w:t>
+      </w:r>
+    </w:p>
+    <w:p>
+      <w:pPr>
+        <w:tabs>
+          <w:tab w:val="left" w:pos="916"/>
+          <w:tab w:val="left" w:pos="1832"/>
+          <w:tab w:val="left" w:pos="2748"/>
+          <w:tab w:val="left" w:pos="3664"/>
+          <w:tab w:val="left" w:pos="4580"/>
+          <w:tab w:val="left" w:pos="5496"/>
+          <w:tab w:val="left" w:pos="6412"/>
+          <w:tab w:val="left" w:pos="7328"/>
+          <w:tab w:val="left" w:pos="8244"/>
+          <w:tab w:val="left" w:pos="9160"/>
+          <w:tab w:val="left" w:pos="10076"/>
+          <w:tab w:val="left" w:pos="10992"/>
+          <w:tab w:val="left" w:pos="11908"/>
+          <w:tab w:val="left" w:pos="12824"/>
+          <w:tab w:val="left" w:pos="13740"/>
+          <w:tab w:val="left" w:pos="14656"/>
+        </w:tabs>
+        <w:spacing w:after="0" w:line="240" w:lineRule="auto"/>
+        <w:rPr>
+          <w:rFonts w:ascii="Times New Roman" w:eastAsia="Times New Roman" w:hAnsi="Times New Roman" w:cs="Times New Roman"/>
+          <w:b/>
+          <w:sz w:val="40"/>
+          <w:szCs w:val="20"/>
+        </w:rPr>
+      </w:pPr>
+    </w:p>
+    <w:p>
+      <w:pPr>
+        <w:tabs>
+          <w:tab w:val="left" w:pos="916"/>
+          <w:tab w:val="left" w:pos="1832"/>
+          <w:tab w:val="left" w:pos="2748"/>
+          <w:tab w:val="left" w:pos="3664"/>
+          <w:tab w:val="left" w:pos="4580"/>
+          <w:tab w:val="left" w:pos="5496"/>
+          <w:tab w:val="left" w:pos="6412"/>
+          <w:tab w:val="left" w:pos="7328"/>
+          <w:tab w:val="left" w:pos="8244"/>
+          <w:tab w:val="left" w:pos="9160"/>
+          <w:tab w:val="left" w:pos="10076"/>
+          <w:tab w:val="left" w:pos="10992"/>
+          <w:tab w:val="left" w:pos="11908"/>
+          <w:tab w:val="left" w:pos="12824"/>
+          <w:tab w:val="left" w:pos="13740"/>
+          <w:tab w:val="left" w:pos="14656"/>
+        </w:tabs>
+        <w:spacing w:after="0" w:line="240" w:lineRule="auto"/>
+        <w:rPr>
+          <w:rFonts w:ascii="Times New Roman" w:eastAsia="Times New Roman" w:hAnsi="Times New Roman" w:cs="Times New Roman"/>
+          <w:b/>
+          <w:sz w:val="40"/>
+          <w:szCs w:val="20"/>
+        </w:rPr>
+      </w:pPr>
+      <w:r>
+        <w:rPr>
+          <w:rFonts w:ascii="Times New Roman" w:eastAsia="Times New Roman" w:hAnsi="Times New Roman" w:cs="Times New Roman"/>
+          <w:b/>
+          <w:sz w:val="40"/>
+          <w:szCs w:val="20"/>
+        </w:rPr>
+        <w:t>✅ Register</w:t>
+      </w:r>
+    </w:p>
+    <w:p>
+      <w:pPr>
+        <w:tabs>
+          <w:tab w:val="left" w:pos="916"/>
+          <w:tab w:val="left" w:pos="1832"/>
+          <w:tab w:val="left" w:pos="2748"/>
+          <w:tab w:val="left" w:pos="3664"/>
+          <w:tab w:val="left" w:pos="4580"/>
+          <w:tab w:val="left" w:pos="5496"/>
+          <w:tab w:val="left" w:pos="6412"/>
+          <w:tab w:val="left" w:pos="7328"/>
+          <w:tab w:val="left" w:pos="8244"/>
+          <w:tab w:val="left" w:pos="9160"/>
+          <w:tab w:val="left" w:pos="10076"/>
+          <w:tab w:val="left" w:pos="10992"/>
+          <w:tab w:val="left" w:pos="11908"/>
+          <w:tab w:val="left" w:pos="12824"/>
+          <w:tab w:val="left" w:pos="13740"/>
+          <w:tab w:val="left" w:pos="14656"/>
+        </w:tabs>
+        <w:spacing w:after="0" w:line="240" w:lineRule="auto"/>
+        <w:rPr>
+          <w:rFonts w:ascii="Times New Roman" w:eastAsia="Times New Roman" w:hAnsi="Times New Roman" w:cs="Times New Roman"/>
+          <w:b/>
+          <w:sz w:val="40"/>
+          <w:szCs w:val="20"/>
+        </w:rPr>
+      </w:pPr>
+      <w:r>
+        <w:rPr>
+          <w:rFonts w:ascii="Times New Roman" w:eastAsia="Times New Roman" w:hAnsi="Times New Roman" w:cs="Times New Roman"/>
+          <w:b/>
+          <w:sz w:val="40"/>
+          <w:szCs w:val="20"/>
+        </w:rPr>
+        <w:t>✅ Login</w:t>
+      </w:r>
+    </w:p>
+    <w:p>
+      <w:pPr>
+        <w:tabs>
+          <w:tab w:val="left" w:pos="916"/>
+          <w:tab w:val="left" w:pos="1832"/>
+          <w:tab w:val="left" w:pos="2748"/>
+          <w:tab w:val="left" w:pos="3664"/>
+          <w:tab w:val="left" w:pos="4580"/>
+          <w:tab w:val="left" w:pos="5496"/>
+          <w:tab w:val="left" w:pos="6412"/>
+          <w:tab w:val="left" w:pos="7328"/>
+          <w:tab w:val="left" w:pos="8244"/>
+          <w:tab w:val="left" w:pos="9160"/>
+          <w:tab w:val="left" w:pos="10076"/>
+          <w:tab w:val="left" w:pos="10992"/>
+          <w:tab w:val="left" w:pos="11908"/>
+          <w:tab w:val="left" w:pos="12824"/>
+          <w:tab w:val="left" w:pos="13740"/>
+          <w:tab w:val="left" w:pos="14656"/>
+        </w:tabs>
+        <w:spacing w:after="0" w:line="240" w:lineRule="auto"/>
+        <w:rPr>
+          <w:rFonts w:ascii="Times New Roman" w:eastAsia="Times New Roman" w:hAnsi="Times New Roman" w:cs="Times New Roman"/>
+          <w:b/>
+          <w:sz w:val="40"/>
+          <w:szCs w:val="20"/>
+        </w:rPr>
+      </w:pPr>
+      <w:r>
+        <w:rPr>
+          <w:rFonts w:ascii="Times New Roman" w:eastAsia="Times New Roman" w:hAnsi="Times New Roman" w:cs="Times New Roman"/>
+          <w:b/>
+          <w:sz w:val="40"/>
+          <w:szCs w:val="20"/>
+        </w:rPr>
+        <w:t>✅ Profile (Protected)</w:t>
+      </w:r>
+    </w:p>
+    <w:p>
+      <w:pPr>
+        <w:tabs>
+          <w:tab w:val="left" w:pos="916"/>
+          <w:tab w:val="left" w:pos="1832"/>
+          <w:tab w:val="left" w:pos="2748"/>
+          <w:tab w:val="left" w:pos="3664"/>
+          <w:tab w:val="left" w:pos="4580"/>
+          <w:tab w:val="left" w:pos="5496"/>
+          <w:tab w:val="left" w:pos="6412"/>
+          <w:tab w:val="left" w:pos="7328"/>
+          <w:tab w:val="left" w:pos="8244"/>
+          <w:tab w:val="left" w:pos="9160"/>
+          <w:tab w:val="left" w:pos="10076"/>
+          <w:tab w:val="left" w:pos="10992"/>
+          <w:tab w:val="left" w:pos="11908"/>
+          <w:tab w:val="left" w:pos="12824"/>
+          <w:tab w:val="left" w:pos="13740"/>
+          <w:tab w:val="left" w:pos="14656"/>
+        </w:tabs>
+        <w:spacing w:after="0" w:line="240" w:lineRule="auto"/>
+        <w:rPr>
+          <w:rFonts w:ascii="Times New Roman" w:eastAsia="Times New Roman" w:hAnsi="Times New Roman" w:cs="Times New Roman"/>
+          <w:b/>
+          <w:sz w:val="40"/>
+          <w:szCs w:val="20"/>
+        </w:rPr>
+      </w:pPr>
+      <w:r>
+        <w:rPr>
+          <w:rFonts w:ascii="Times New Roman" w:eastAsia="Times New Roman" w:hAnsi="Times New Roman" w:cs="Times New Roman"/>
+          <w:b/>
+          <w:sz w:val="40"/>
+          <w:szCs w:val="20"/>
+        </w:rPr>
+        <w:t>✅ Logout</w:t>
+      </w:r>
+    </w:p>
+    <w:p>
+      <w:pPr>
+        <w:spacing w:before="100" w:beforeAutospacing="1" w:after="100" w:afterAutospacing="1" w:line="240" w:lineRule="auto"/>
+        <w:jc w:val="both"/>
+        <w:rPr>
+          <w:rFonts w:ascii="Times New Roman" w:eastAsia="Times New Roman" w:hAnsi="Times New Roman" w:cs="Times New Roman"/>
+          <w:sz w:val="36"/>
+          <w:szCs w:val="36"/>
+        </w:rPr>
+      </w:pPr>
+    </w:p>
+    <w:p>
+      <w:pPr>
+        <w:spacing w:before="100" w:beforeAutospacing="1" w:after="100" w:afterAutospacing="1" w:line="240" w:lineRule="auto"/>
+        <w:jc w:val="both"/>
+        <w:rPr>
+          <w:rFonts w:ascii="Times New Roman" w:eastAsia="Times New Roman" w:hAnsi="Times New Roman" w:cs="Times New Roman"/>
+          <w:sz w:val="36"/>
+          <w:szCs w:val="36"/>
+        </w:rPr>
+      </w:pPr>
+    </w:p>
+    <w:p>
+      <w:pPr>
+        <w:spacing w:before="100" w:beforeAutospacing="1" w:after="100" w:afterAutospacing="1" w:line="240" w:lineRule="auto"/>
+        <w:jc w:val="both"/>
+        <w:rPr>
+          <w:rFonts w:ascii="Times New Roman" w:eastAsia="Times New Roman" w:hAnsi="Times New Roman" w:cs="Times New Roman"/>
           <w:sz w:val="36"/>
           <w:szCs w:val="36"/>
         </w:rPr>

</xml_diff>